<commit_message>
Fixed issue with DOCX for comp screener.
</commit_message>
<xml_diff>
--- a/docassemble/USCISApplications/data/templates/Comp_legal_screener.docx
+++ b/docassemble/USCISApplications/data/templates/Comp_legal_screener.docx
@@ -244,29 +244,21 @@
             <w:pPr>
               <w:spacing w:before="60"/>
             </w:pPr>
-            <w:sdt>
-              <w:sdtPr>
-                <w:tag w:val="goog_rdk_0"/>
-                <w:id w:val="-329682475"/>
-              </w:sdtPr>
-              <w:sdtContent>
-                <w:r>
-                  <w:t>{{ output_checkbox(</w:t>
-                </w:r>
-                <w:r>
-                  <w:t>i</w:t>
-                </w:r>
-                <w:r>
-                  <w:t>nformed_agreement</w:t>
-                </w:r>
-                <w:r>
-                  <w:t>) }}</w:t>
-                </w:r>
-                <w:r>
-                  <w:t xml:space="preserve"> </w:t>
-                </w:r>
-              </w:sdtContent>
-            </w:sdt>
+            <w:r>
+              <w:t>{{ output_checkbox(</w:t>
+            </w:r>
+            <w:r>
+              <w:t>i</w:t>
+            </w:r>
+            <w:r>
+              <w:t>nformed_agreement</w:t>
+            </w:r>
+            <w:r>
+              <w:t>) }}</w:t>
+            </w:r>
+            <w:r>
+              <w:t xml:space="preserve"> </w:t>
+            </w:r>
             <w:r>
               <w:rPr>
                 <w:b/>
@@ -298,33 +290,18 @@
           <w:bookmarkStart w:id="0" w:name="_heading=h.gjdgxs" w:colFirst="0" w:colLast="0"/>
           <w:bookmarkEnd w:id="0"/>
           <w:p>
-            <w:sdt>
-              <w:sdtPr>
-                <w:tag w:val="goog_rdk_1"/>
-                <w:id w:val="1227886610"/>
-              </w:sdtPr>
-              <w:sdtContent/>
-            </w:sdt>
-            <w:sdt>
-              <w:sdtPr>
-                <w:tag w:val="goog_rdk_0"/>
-                <w:id w:val="1155343807"/>
-              </w:sdtPr>
-              <w:sdtContent>
-                <w:r>
-                  <w:t>{{ output_checkbox(</w:t>
-                </w:r>
-                <w:r>
-                  <w:t>explained_role</w:t>
-                </w:r>
-                <w:r>
-                  <w:t>) }}</w:t>
-                </w:r>
-                <w:r>
-                  <w:t xml:space="preserve"> </w:t>
-                </w:r>
-              </w:sdtContent>
-            </w:sdt>
+            <w:r>
+              <w:t>{{ output_checkbox(</w:t>
+            </w:r>
+            <w:r>
+              <w:t>explained_role</w:t>
+            </w:r>
+            <w:r>
+              <w:t>) }}</w:t>
+            </w:r>
+            <w:r>
+              <w:t xml:space="preserve"> </w:t>
+            </w:r>
             <w:r>
               <w:t xml:space="preserve"> Explained: I am a</w:t>
             </w:r>
@@ -350,23 +327,15 @@
                 <w:b/>
               </w:rPr>
             </w:pPr>
-            <w:sdt>
-              <w:sdtPr>
-                <w:tag w:val="goog_rdk_5"/>
-                <w:id w:val="1166978188"/>
-              </w:sdtPr>
-              <w:sdtContent>
-                <w:r>
-                  <w:t>{{ output_checkbox(</w:t>
-                </w:r>
-                <w:r>
-                  <w:t>consent_agreement</w:t>
-                </w:r>
-                <w:r>
-                  <w:t>) }}</w:t>
-                </w:r>
-              </w:sdtContent>
-            </w:sdt>
+            <w:r>
+              <w:t>{{ output_checkbox(</w:t>
+            </w:r>
+            <w:r>
+              <w:t>consent_agreement</w:t>
+            </w:r>
+            <w:r>
+              <w:t>) }}</w:t>
+            </w:r>
             <w:r>
               <w:t xml:space="preserve"> </w:t>
             </w:r>
@@ -396,22 +365,14 @@
                 <w:b/>
               </w:rPr>
             </w:pPr>
-            <w:sdt>
-              <w:sdtPr>
-                <w:tag w:val="goog_rdk_6"/>
-                <w:id w:val="-538666335"/>
-              </w:sdtPr>
-              <w:sdtContent>
-                <w:r>
-                  <w:rPr>
-                    <w:rFonts w:ascii="Arial Unicode MS" w:eastAsia="Arial Unicode MS" w:hAnsi="Arial Unicode MS" w:cs="Arial Unicode MS"/>
-                    <w:sz w:val="24"/>
-                    <w:szCs w:val="24"/>
-                  </w:rPr>
-                  <w:t>☐</w:t>
-                </w:r>
-              </w:sdtContent>
-            </w:sdt>
+            <w:r>
+              <w:rPr>
+                <w:rFonts w:ascii="Arial Unicode MS" w:eastAsia="Arial Unicode MS" w:hAnsi="Arial Unicode MS" w:cs="Arial Unicode MS"/>
+                <w:sz w:val="24"/>
+                <w:szCs w:val="24"/>
+              </w:rPr>
+              <w:t>☐</w:t>
+            </w:r>
             <w:r>
               <w:rPr>
                 <w:b/>
@@ -483,20 +444,6 @@
               </w:rPr>
               <w:t xml:space="preserve">BASIC </w:t>
             </w:r>
-            <w:sdt>
-              <w:sdtPr>
-                <w:tag w:val="goog_rdk_7"/>
-                <w:id w:val="1749382640"/>
-              </w:sdtPr>
-              <w:sdtContent/>
-            </w:sdt>
-            <w:sdt>
-              <w:sdtPr>
-                <w:tag w:val="goog_rdk_8"/>
-                <w:id w:val="-792052402"/>
-              </w:sdtPr>
-              <w:sdtContent/>
-            </w:sdt>
             <w:r>
               <w:rPr>
                 <w:b/>
@@ -1284,77 +1231,39 @@
             </w:tcBorders>
           </w:tcPr>
           <w:p>
-            <w:sdt>
-              <w:sdtPr>
-                <w:tag w:val="goog_rdk_9"/>
-                <w:id w:val="1325318336"/>
-              </w:sdtPr>
-              <w:sdtContent/>
-            </w:sdt>
             <w:r>
               <w:rPr>
                 <w:b/>
               </w:rPr>
               <w:t xml:space="preserve">Current Immigration Legal Representative?  </w:t>
             </w:r>
-            <w:sdt>
-              <w:sdtPr>
-                <w:tag w:val="goog_rdk_10"/>
-                <w:id w:val="-1796826122"/>
-              </w:sdtPr>
-              <w:sdtContent>
-                <w:sdt>
-                  <w:sdtPr>
-                    <w:tag w:val="goog_rdk_12"/>
-                    <w:id w:val="-1302063890"/>
-                  </w:sdtPr>
-                  <w:sdtContent>
-                    <w:r>
-                      <w:t>{{ output_checkbox(</w:t>
-                    </w:r>
-                    <w:r>
-                      <w:t>users[i].</w:t>
-                    </w:r>
-                    <w:r>
-                      <w:t>current_rep</w:t>
-                    </w:r>
-                    <w:r>
-                      <w:t>)  }}</w:t>
-                    </w:r>
-                  </w:sdtContent>
-                </w:sdt>
-              </w:sdtContent>
-            </w:sdt>
+            <w:r>
+              <w:t>{{ output_checkbox(</w:t>
+            </w:r>
+            <w:r>
+              <w:t>users[i].</w:t>
+            </w:r>
+            <w:r>
+              <w:t>current_rep</w:t>
+            </w:r>
+            <w:r>
+              <w:t>)  }}</w:t>
+            </w:r>
             <w:r>
               <w:t xml:space="preserve">Y    </w:t>
             </w:r>
-            <w:sdt>
-              <w:sdtPr>
-                <w:tag w:val="goog_rdk_12"/>
-                <w:id w:val="497624823"/>
-              </w:sdtPr>
-              <w:sdtContent>
-                <w:r>
-                  <w:t xml:space="preserve">{{ output_checkbox(not </w:t>
-                </w:r>
-                <w:r>
-                  <w:t>users[i].</w:t>
-                </w:r>
-                <w:r>
-                  <w:t>current_rep</w:t>
-                </w:r>
-                <w:r>
-                  <w:t>)  }}</w:t>
-                </w:r>
-              </w:sdtContent>
-            </w:sdt>
-            <w:sdt>
-              <w:sdtPr>
-                <w:tag w:val="goog_rdk_11"/>
-                <w:id w:val="2113018631"/>
-              </w:sdtPr>
-              <w:sdtContent/>
-            </w:sdt>
+            <w:r>
+              <w:t xml:space="preserve">{{ output_checkbox(not </w:t>
+            </w:r>
+            <w:r>
+              <w:t>users[i].</w:t>
+            </w:r>
+            <w:r>
+              <w:t>current_rep</w:t>
+            </w:r>
+            <w:r>
+              <w:t>)  }}</w:t>
+            </w:r>
             <w:r>
               <w:t xml:space="preserve">N    </w:t>
             </w:r>
@@ -1394,54 +1303,30 @@
               </w:rPr>
               <w:t xml:space="preserve">NTA filed?  </w:t>
             </w:r>
-            <w:sdt>
-              <w:sdtPr>
-                <w:tag w:val="goog_rdk_12"/>
-                <w:id w:val="492143066"/>
-              </w:sdtPr>
-              <w:sdtContent>
-                <w:r>
-                  <w:t>{{ output_checkbox(</w:t>
-                </w:r>
-                <w:r>
-                  <w:t>users[i].</w:t>
-                </w:r>
-                <w:r>
-                  <w:t>notice_to_appear</w:t>
-                </w:r>
-                <w:r>
-                  <w:t>)  }}</w:t>
-                </w:r>
-              </w:sdtContent>
-            </w:sdt>
+            <w:r>
+              <w:t>{{ output_checkbox(</w:t>
+            </w:r>
+            <w:r>
+              <w:t>users[i].</w:t>
+            </w:r>
+            <w:r>
+              <w:t>notice_to_appear</w:t>
+            </w:r>
+            <w:r>
+              <w:t>)  }}</w:t>
+            </w:r>
             <w:r>
               <w:t xml:space="preserve">Y  </w:t>
             </w:r>
-            <w:sdt>
-              <w:sdtPr>
-                <w:tag w:val="goog_rdk_13"/>
-                <w:id w:val="-758913936"/>
-              </w:sdtPr>
-              <w:sdtContent>
-                <w:sdt>
-                  <w:sdtPr>
-                    <w:tag w:val="goog_rdk_12"/>
-                    <w:id w:val="384458599"/>
-                  </w:sdtPr>
-                  <w:sdtContent>
-                    <w:r>
-                      <w:t xml:space="preserve">{{ output_checkbox(not </w:t>
-                    </w:r>
-                    <w:r>
-                      <w:t>users[i].</w:t>
-                    </w:r>
-                    <w:r>
-                      <w:t>notice_to_appear)  }}</w:t>
-                    </w:r>
-                  </w:sdtContent>
-                </w:sdt>
-              </w:sdtContent>
-            </w:sdt>
+            <w:r>
+              <w:t xml:space="preserve">{{ output_checkbox(not </w:t>
+            </w:r>
+            <w:r>
+              <w:t>users[i].</w:t>
+            </w:r>
+            <w:r>
+              <w:t>notice_to_appear)  }}</w:t>
+            </w:r>
             <w:r>
               <w:t>N</w:t>
             </w:r>
@@ -1454,65 +1339,33 @@
               </w:rPr>
               <w:t xml:space="preserve">Hearing?  </w:t>
             </w:r>
-            <w:sdt>
-              <w:sdtPr>
-                <w:tag w:val="goog_rdk_14"/>
-                <w:id w:val="-96107212"/>
-              </w:sdtPr>
-              <w:sdtContent>
-                <w:sdt>
-                  <w:sdtPr>
-                    <w:tag w:val="goog_rdk_12"/>
-                    <w:id w:val="-743174270"/>
-                  </w:sdtPr>
-                  <w:sdtContent>
-                    <w:r>
-                      <w:t>{{ output_checkbox(</w:t>
-                    </w:r>
-                    <w:r>
-                      <w:t>users[i].</w:t>
-                    </w:r>
-                    <w:r>
-                      <w:t>hearing)  }}</w:t>
-                    </w:r>
-                  </w:sdtContent>
-                </w:sdt>
-              </w:sdtContent>
-            </w:sdt>
+            <w:r>
+              <w:t>{{ output_checkbox(</w:t>
+            </w:r>
+            <w:r>
+              <w:t>users[i].</w:t>
+            </w:r>
+            <w:r>
+              <w:t>hearing)  }}</w:t>
+            </w:r>
             <w:r>
               <w:t xml:space="preserve">Y  </w:t>
             </w:r>
-            <w:sdt>
-              <w:sdtPr>
-                <w:tag w:val="goog_rdk_15"/>
-                <w:id w:val="1780913404"/>
-              </w:sdtPr>
-              <w:sdtContent>
-                <w:sdt>
-                  <w:sdtPr>
-                    <w:tag w:val="goog_rdk_12"/>
-                    <w:id w:val="-764529374"/>
-                  </w:sdtPr>
-                  <w:sdtContent>
-                    <w:r>
-                      <w:t xml:space="preserve">{{ output_checkbox( </w:t>
-                    </w:r>
-                    <w:r>
-                      <w:t>users[i].</w:t>
-                    </w:r>
-                    <w:r>
-                      <w:t>hearing</w:t>
-                    </w:r>
-                    <w:r>
-                      <w:t xml:space="preserve"> == False</w:t>
-                    </w:r>
-                    <w:r>
-                      <w:t>)  }}</w:t>
-                    </w:r>
-                  </w:sdtContent>
-                </w:sdt>
-              </w:sdtContent>
-            </w:sdt>
+            <w:r>
+              <w:t xml:space="preserve">{{ output_checkbox( </w:t>
+            </w:r>
+            <w:r>
+              <w:t>users[i].</w:t>
+            </w:r>
+            <w:r>
+              <w:t>hearing</w:t>
+            </w:r>
+            <w:r>
+              <w:t xml:space="preserve"> == False</w:t>
+            </w:r>
+            <w:r>
+              <w:t>)  }}</w:t>
+            </w:r>
             <w:r>
               <w:t>N</w:t>
             </w:r>
@@ -1551,81 +1404,33 @@
                 <w:b/>
               </w:rPr>
             </w:pPr>
-            <w:sdt>
-              <w:sdtPr>
-                <w:tag w:val="goog_rdk_17"/>
-                <w:id w:val="-641741220"/>
-              </w:sdtPr>
-              <w:sdtContent>
-                <w:sdt>
-                  <w:sdtPr>
-                    <w:tag w:val="goog_rdk_14"/>
-                    <w:id w:val="1971318788"/>
-                  </w:sdtPr>
-                  <w:sdtContent>
-                    <w:sdt>
-                      <w:sdtPr>
-                        <w:tag w:val="goog_rdk_12"/>
-                        <w:id w:val="716403373"/>
-                      </w:sdtPr>
-                      <w:sdtContent>
-                        <w:r>
-                          <w:t xml:space="preserve">Type: </w:t>
-                        </w:r>
-                        <w:r>
-                          <w:t>{{ output_checkbox(</w:t>
-                        </w:r>
-                        <w:r>
-                          <w:t>users[i].</w:t>
-                        </w:r>
-                        <w:r>
-                          <w:t>options == ‘mc’)  }}</w:t>
-                        </w:r>
-                      </w:sdtContent>
-                    </w:sdt>
-                  </w:sdtContent>
-                </w:sdt>
-              </w:sdtContent>
-            </w:sdt>
+            <w:r>
+              <w:t xml:space="preserve">Type: </w:t>
+            </w:r>
+            <w:r>
+              <w:t>{{ output_checkbox(</w:t>
+            </w:r>
+            <w:r>
+              <w:t>users[i].</w:t>
+            </w:r>
+            <w:r>
+              <w:t>options == ‘mc’)  }}</w:t>
+            </w:r>
             <w:r>
               <w:t>MC</w:t>
             </w:r>
             <w:r>
               <w:t xml:space="preserve"> </w:t>
             </w:r>
-            <w:sdt>
-              <w:sdtPr>
-                <w:tag w:val="goog_rdk_18"/>
-                <w:id w:val="-51394522"/>
-              </w:sdtPr>
-              <w:sdtContent>
-                <w:sdt>
-                  <w:sdtPr>
-                    <w:tag w:val="goog_rdk_14"/>
-                    <w:id w:val="1005021344"/>
-                  </w:sdtPr>
-                  <w:sdtContent>
-                    <w:sdt>
-                      <w:sdtPr>
-                        <w:tag w:val="goog_rdk_12"/>
-                        <w:id w:val="440727297"/>
-                      </w:sdtPr>
-                      <w:sdtContent>
-                        <w:r>
-                          <w:t>{{ output_checkbox(</w:t>
-                        </w:r>
-                        <w:r>
-                          <w:t>users[i].</w:t>
-                        </w:r>
-                        <w:r>
-                          <w:t>options == ‘indv’)  }}</w:t>
-                        </w:r>
-                      </w:sdtContent>
-                    </w:sdt>
-                  </w:sdtContent>
-                </w:sdt>
-              </w:sdtContent>
-            </w:sdt>
+            <w:r>
+              <w:t>{{ output_checkbox(</w:t>
+            </w:r>
+            <w:r>
+              <w:t>users[i].</w:t>
+            </w:r>
+            <w:r>
+              <w:t>options == ‘indv’)  }}</w:t>
+            </w:r>
             <w:r>
               <w:t>INDV</w:t>
             </w:r>
@@ -1635,86 +1440,39 @@
             <w:r>
               <w:t xml:space="preserve"> </w:t>
             </w:r>
-            <w:sdt>
-              <w:sdtPr>
-                <w:tag w:val="goog_rdk_19"/>
-                <w:id w:val="-1066949830"/>
-              </w:sdtPr>
-              <w:sdtContent>
-                <w:sdt>
-                  <w:sdtPr>
-                    <w:tag w:val="goog_rdk_14"/>
-                    <w:id w:val="1496376876"/>
-                  </w:sdtPr>
-                  <w:sdtContent>
-                    <w:sdt>
-                      <w:sdtPr>
-                        <w:tag w:val="goog_rdk_12"/>
-                        <w:id w:val="-1561941639"/>
-                      </w:sdtPr>
-                      <w:sdtContent>
-                        <w:r>
-                          <w:t>{{ output_checkbox(</w:t>
-                        </w:r>
-                        <w:r>
-                          <w:t>users[i].</w:t>
-                        </w:r>
-                        <w:r>
-                          <w:t>options == ‘bond’)  }}</w:t>
-                        </w:r>
-                      </w:sdtContent>
-                    </w:sdt>
-                  </w:sdtContent>
-                </w:sdt>
-              </w:sdtContent>
-            </w:sdt>
+            <w:r>
+              <w:t>{{ output_checkbox(</w:t>
+            </w:r>
+            <w:r>
+              <w:t>users[i].</w:t>
+            </w:r>
+            <w:r>
+              <w:t>options == ‘bond’)  }}</w:t>
+            </w:r>
             <w:r>
               <w:t>Bon</w:t>
             </w:r>
-            <w:sdt>
-              <w:sdtPr>
-                <w:tag w:val="goog_rdk_16"/>
-                <w:id w:val="1289782061"/>
-              </w:sdtPr>
-              <w:sdtContent/>
-            </w:sdt>
             <w:r>
               <w:t>d</w:t>
             </w:r>
             <w:r>
               <w:t xml:space="preserve"> </w:t>
             </w:r>
-            <w:sdt>
-              <w:sdtPr>
-                <w:tag w:val="goog_rdk_14"/>
-                <w:id w:val="508259665"/>
-              </w:sdtPr>
-              <w:sdtContent>
-                <w:sdt>
-                  <w:sdtPr>
-                    <w:tag w:val="goog_rdk_12"/>
-                    <w:id w:val="56983613"/>
-                  </w:sdtPr>
-                  <w:sdtContent>
-                    <w:r>
-                      <w:t>{{ output_checkbox(</w:t>
-                    </w:r>
-                    <w:r>
-                      <w:t>users[i].</w:t>
-                    </w:r>
-                    <w:r>
-                      <w:t>options == ‘idk</w:t>
-                    </w:r>
-                    <w:r>
-                      <w:t>’</w:t>
-                    </w:r>
-                    <w:r>
-                      <w:t>)  }}</w:t>
-                    </w:r>
-                  </w:sdtContent>
-                </w:sdt>
-              </w:sdtContent>
-            </w:sdt>
+            <w:r>
+              <w:t>{{ output_checkbox(</w:t>
+            </w:r>
+            <w:r>
+              <w:t>users[i].</w:t>
+            </w:r>
+            <w:r>
+              <w:t>options == ‘idk</w:t>
+            </w:r>
+            <w:r>
+              <w:t>’</w:t>
+            </w:r>
+            <w:r>
+              <w:t>)  }}</w:t>
+            </w:r>
             <w:r>
               <w:t xml:space="preserve"> Don’t know</w:t>
             </w:r>
@@ -1740,67 +1498,36 @@
               </w:rPr>
               <w:t xml:space="preserve">ICE Check-In? </w:t>
             </w:r>
-            <w:sdt>
-              <w:sdtPr>
-                <w:tag w:val="goog_rdk_20"/>
-                <w:id w:val="1300110576"/>
-              </w:sdtPr>
-              <w:sdtContent>
-                <w:sdt>
-                  <w:sdtPr>
-                    <w:tag w:val="goog_rdk_12"/>
-                    <w:id w:val="813526336"/>
-                  </w:sdtPr>
-                  <w:sdtContent>
-                    <w:r>
-                      <w:t>{{ output_checkbox(</w:t>
-                    </w:r>
-                    <w:r>
-                      <w:t>users[i].</w:t>
-                    </w:r>
-                    <w:r>
-                      <w:t>ice_check</w:t>
-                    </w:r>
-                    <w:r>
-                      <w:t>)  }}</w:t>
-                    </w:r>
-                  </w:sdtContent>
-                </w:sdt>
-              </w:sdtContent>
-            </w:sdt>
+            <w:r>
+              <w:t>{{ output_checkbox(</w:t>
+            </w:r>
+            <w:r>
+              <w:t>users[i].</w:t>
+            </w:r>
+            <w:r>
+              <w:t>ice_check</w:t>
+            </w:r>
+            <w:r>
+              <w:t>)  }}</w:t>
+            </w:r>
             <w:r>
               <w:t xml:space="preserve">Y </w:t>
             </w:r>
-            <w:sdt>
-              <w:sdtPr>
-                <w:tag w:val="goog_rdk_12"/>
-                <w:id w:val="2071303870"/>
-              </w:sdtPr>
-              <w:sdtContent>
-                <w:r>
-                  <w:t xml:space="preserve">{{ output_checkbox(not </w:t>
-                </w:r>
-                <w:r>
-                  <w:t>users[i].</w:t>
-                </w:r>
-                <w:r>
-                  <w:t>i</w:t>
-                </w:r>
-                <w:r>
-                  <w:t>ce_check</w:t>
-                </w:r>
-                <w:r>
-                  <w:t>)  }}</w:t>
-                </w:r>
-              </w:sdtContent>
-            </w:sdt>
-            <w:sdt>
-              <w:sdtPr>
-                <w:tag w:val="goog_rdk_21"/>
-                <w:id w:val="1617713591"/>
-              </w:sdtPr>
-              <w:sdtContent/>
-            </w:sdt>
+            <w:r>
+              <w:t xml:space="preserve">{{ output_checkbox(not </w:t>
+            </w:r>
+            <w:r>
+              <w:t>users[i].</w:t>
+            </w:r>
+            <w:r>
+              <w:t>i</w:t>
+            </w:r>
+            <w:r>
+              <w:t>ce_check</w:t>
+            </w:r>
+            <w:r>
+              <w:t>)  }}</w:t>
+            </w:r>
             <w:r>
               <w:t>N</w:t>
             </w:r>
@@ -4751,13 +4478,6 @@
               <w:spacing w:line="240" w:lineRule="auto"/>
               <w:ind w:left="70"/>
             </w:pPr>
-            <w:sdt>
-              <w:sdtPr>
-                <w:tag w:val="goog_rdk_33"/>
-                <w:id w:val="754862658"/>
-              </w:sdtPr>
-              <w:sdtContent/>
-            </w:sdt>
             <w:r>
               <w:rPr>
                 <w:b/>
@@ -5246,13 +4966,6 @@
                 <w:b/>
               </w:rPr>
             </w:pPr>
-            <w:sdt>
-              <w:sdtPr>
-                <w:tag w:val="goog_rdk_34"/>
-                <w:id w:val="1953051513"/>
-              </w:sdtPr>
-              <w:sdtContent/>
-            </w:sdt>
             <w:r>
               <w:rPr>
                 <w:b/>
@@ -6141,18 +5854,9 @@
               </w:rPr>
               <w:t>Notes:</w:t>
             </w:r>
-            <w:sdt>
-              <w:sdtPr>
-                <w:tag w:val="goog_rdk_35"/>
-                <w:id w:val="-1568177340"/>
-                <w:showingPlcHdr/>
-              </w:sdtPr>
-              <w:sdtContent>
-                <w:r>
-                  <w:t xml:space="preserve">     </w:t>
-                </w:r>
-              </w:sdtContent>
-            </w:sdt>
+            <w:r>
+              <w:t xml:space="preserve">     </w:t>
+            </w:r>
           </w:p>
           <w:p>
             <w:pPr>
@@ -6414,17 +6118,9 @@
             <w:r>
               <w:t xml:space="preserve">Have you ever been fingerprinted </w:t>
             </w:r>
-            <w:sdt>
-              <w:sdtPr>
-                <w:tag w:val="goog_rdk_71"/>
-                <w:id w:val="895391601"/>
-              </w:sdtPr>
-              <w:sdtContent>
-                <w:r>
-                  <w:t xml:space="preserve">or had your picture taken </w:t>
-                </w:r>
-              </w:sdtContent>
-            </w:sdt>
+            <w:r>
+              <w:t xml:space="preserve">or had your picture taken </w:t>
+            </w:r>
             <w:r>
               <w:t>by the police (other than an immigration officer)?</w:t>
             </w:r>
@@ -6778,17 +6474,9 @@
             <w:r>
               <w:t>Have you ever been involved or associated with any gangs, in the U.S. or any other country?</w:t>
             </w:r>
-            <w:sdt>
-              <w:sdtPr>
-                <w:tag w:val="goog_rdk_103"/>
-                <w:id w:val="706911935"/>
-              </w:sdtPr>
-              <w:sdtContent>
-                <w:r>
-                  <w:t xml:space="preserve"> Or accused of being involved with a gang?</w:t>
-                </w:r>
-              </w:sdtContent>
-            </w:sdt>
+            <w:r>
+              <w:t xml:space="preserve"> Or accused of being involved with a gang?</w:t>
+            </w:r>
           </w:p>
         </w:tc>
         <w:tc>
@@ -6846,17 +6534,9 @@
               <w:lastRenderedPageBreak/>
               <w:t xml:space="preserve">Have you ever been friends with </w:t>
             </w:r>
-            <w:sdt>
-              <w:sdtPr>
-                <w:tag w:val="goog_rdk_104"/>
-                <w:id w:val="1599057044"/>
-              </w:sdtPr>
-              <w:sdtContent>
-                <w:r>
-                  <w:t xml:space="preserve">or have family members who are </w:t>
-                </w:r>
-              </w:sdtContent>
-            </w:sdt>
+            <w:r>
+              <w:t xml:space="preserve">or have family members who are </w:t>
+            </w:r>
             <w:r>
               <w:t>known gang members, in the U.S. or any other country?</w:t>
             </w:r>
@@ -6959,144 +6639,136 @@
             </w:tcBorders>
             <w:shd w:val="clear" w:color="auto" w:fill="auto"/>
           </w:tcPr>
-          <w:sdt>
-            <w:sdtPr>
-              <w:tag w:val="goog_rdk_136"/>
-              <w:id w:val="1177852861"/>
-            </w:sdtPr>
-            <w:sdtContent>
-              <w:p>
-                <w:pPr>
-                  <w:spacing w:after="0" w:line="240" w:lineRule="auto"/>
-                  <w:ind w:left="82" w:right="90"/>
-                </w:pPr>
-                <w:r>
-                  <w:rPr>
-                    <w:b/>
-                    <w:u w:val="single"/>
-                  </w:rPr>
-                  <w:t>NOTES</w:t>
-                </w:r>
-                <w:r>
-                  <w:rPr>
-                    <w:b/>
-                  </w:rPr>
-                  <w:t xml:space="preserve"> - Be as specific as possible.</w:t>
-                </w:r>
-                <w:r>
-                  <w:rPr>
-                    <w:b/>
-                  </w:rPr>
-                  <w:br/>
-                </w:r>
-                <w:r>
-                  <w:t>{% if  users[i].criminal_3a_yes %}a. {{ users[i].criminal_3a_details }}{% endif %}</w:t>
-                </w:r>
-              </w:p>
-              <w:p>
-                <w:pPr>
-                  <w:spacing w:after="0" w:line="240" w:lineRule="auto"/>
-                  <w:ind w:left="82" w:right="90"/>
-                </w:pPr>
-                <w:r>
-                  <w:t>{</w:t>
-                </w:r>
-                <w:r>
-                  <w:t>%</w:t>
-                </w:r>
-                <w:r>
-                  <w:t xml:space="preserve"> if  users[i].criminal_3b_yes %}b. {{ users[i].criminal_3b_details }}{% endif %}</w:t>
-                </w:r>
-              </w:p>
-              <w:p>
-                <w:pPr>
-                  <w:spacing w:after="0" w:line="240" w:lineRule="auto"/>
-                  <w:ind w:left="82" w:right="90"/>
-                </w:pPr>
-                <w:r>
-                  <w:t>{% if  users[i].criminal_3c_yes %}c. {{ users[i].criminal_3c_details }}{% endif %}</w:t>
-                </w:r>
-              </w:p>
-              <w:p>
-                <w:pPr>
-                  <w:spacing w:after="0" w:line="240" w:lineRule="auto"/>
-                  <w:ind w:left="82" w:right="90"/>
-                </w:pPr>
-                <w:r>
-                  <w:t>{% if  users[i].criminal_3d_yes %}d. {{ users[i].criminal_3d_details }}{% endif %}</w:t>
-                </w:r>
-              </w:p>
-              <w:p>
-                <w:pPr>
-                  <w:spacing w:after="0" w:line="240" w:lineRule="auto"/>
-                  <w:ind w:left="82" w:right="90"/>
-                </w:pPr>
-                <w:r>
-                  <w:t>{% if  users[i].criminal_3e_yes %}e. {{ users[i].criminal_3e_details }}{% endif %}</w:t>
-                </w:r>
-              </w:p>
-              <w:p>
-                <w:pPr>
-                  <w:spacing w:after="0" w:line="240" w:lineRule="auto"/>
-                  <w:ind w:left="82" w:right="90"/>
-                </w:pPr>
-                <w:r>
-                  <w:t>{% if  users[i].criminal_3f_yes %}f. {{ users[i].criminal_3f_details }}{% endif %}</w:t>
-                </w:r>
-              </w:p>
-              <w:p>
-                <w:pPr>
-                  <w:spacing w:after="0" w:line="240" w:lineRule="auto"/>
-                  <w:ind w:left="82" w:right="90"/>
-                </w:pPr>
-                <w:r>
-                  <w:t>{% if  users[i].criminal_3g_yes %}g. {{ users[i].criminal_3g_details }}{% endif %}</w:t>
-                </w:r>
-              </w:p>
-              <w:p>
-                <w:pPr>
-                  <w:spacing w:after="0" w:line="240" w:lineRule="auto"/>
-                  <w:ind w:left="82" w:right="90"/>
-                </w:pPr>
-                <w:r>
-                  <w:t>{% if  users[i].criminal_3h_yes %}h. {{ users[i].criminal_3h_details }}{% endif %}</w:t>
-                </w:r>
-              </w:p>
-              <w:p>
-                <w:pPr>
-                  <w:spacing w:after="0" w:line="240" w:lineRule="auto"/>
-                  <w:ind w:left="82" w:right="90"/>
-                </w:pPr>
-                <w:r>
-                  <w:t>{% if  users[i].criminal_3i_yes %}i. {{ users[i].criminal_3i_details }}{% endif %}</w:t>
-                </w:r>
-              </w:p>
-              <w:p>
-                <w:pPr>
-                  <w:spacing w:after="0" w:line="240" w:lineRule="auto"/>
-                  <w:ind w:left="82" w:right="90"/>
-                </w:pPr>
-                <w:r>
-                  <w:t>{% if  users[i].criminal_3j_yes %}j. {{ users[i].criminal_3j_details }}{% endif %}</w:t>
-                </w:r>
-              </w:p>
-              <w:p>
-                <w:pPr>
-                  <w:spacing w:after="0" w:line="240" w:lineRule="auto"/>
-                  <w:ind w:left="82" w:right="90"/>
-                </w:pPr>
-                <w:r>
-                  <w:t>{% if  users[i].criminal_3k_yes %}k. {{ users[i].criminal_3k_details }}{% endif %}</w:t>
-                </w:r>
-              </w:p>
-              <w:p>
-                <w:pPr>
-                  <w:spacing w:after="0" w:line="240" w:lineRule="auto"/>
-                  <w:ind w:left="720"/>
-                </w:pPr>
-              </w:p>
-            </w:sdtContent>
-          </w:sdt>
+          <w:p>
+            <w:pPr>
+              <w:spacing w:after="0" w:line="240" w:lineRule="auto"/>
+              <w:ind w:left="82" w:right="90"/>
+            </w:pPr>
+            <w:r>
+              <w:rPr>
+                <w:b/>
+                <w:u w:val="single"/>
+              </w:rPr>
+              <w:t>NOTES</w:t>
+            </w:r>
+            <w:r>
+              <w:rPr>
+                <w:b/>
+              </w:rPr>
+              <w:t xml:space="preserve"> - Be as specific as possible.</w:t>
+            </w:r>
+            <w:r>
+              <w:rPr>
+                <w:b/>
+              </w:rPr>
+              <w:br/>
+            </w:r>
+            <w:r>
+              <w:t>{% if  users[i].criminal_3a_yes %}a. {{ users[i].criminal_3a_details }}{% endif %}</w:t>
+            </w:r>
+          </w:p>
+          <w:p>
+            <w:pPr>
+              <w:spacing w:after="0" w:line="240" w:lineRule="auto"/>
+              <w:ind w:left="82" w:right="90"/>
+            </w:pPr>
+            <w:r>
+              <w:t>{</w:t>
+            </w:r>
+            <w:r>
+              <w:t>%</w:t>
+            </w:r>
+            <w:r>
+              <w:t xml:space="preserve"> if  users[i].criminal_3b_yes %}b. {{ users[i].criminal_3b_details }}{% endif %}</w:t>
+            </w:r>
+          </w:p>
+          <w:p>
+            <w:pPr>
+              <w:spacing w:after="0" w:line="240" w:lineRule="auto"/>
+              <w:ind w:left="82" w:right="90"/>
+            </w:pPr>
+            <w:r>
+              <w:t>{% if  users[i].criminal_3c_yes %}c. {{ users[i].criminal_3c_details }}{% endif %}</w:t>
+            </w:r>
+          </w:p>
+          <w:p>
+            <w:pPr>
+              <w:spacing w:after="0" w:line="240" w:lineRule="auto"/>
+              <w:ind w:left="82" w:right="90"/>
+            </w:pPr>
+            <w:r>
+              <w:t>{% if  users[i].criminal_3d_yes %}d. {{ users[i].criminal_3d_details }}{% endif %}</w:t>
+            </w:r>
+          </w:p>
+          <w:p>
+            <w:pPr>
+              <w:spacing w:after="0" w:line="240" w:lineRule="auto"/>
+              <w:ind w:left="82" w:right="90"/>
+            </w:pPr>
+            <w:r>
+              <w:t>{% if  users[i].criminal_3e_yes %}e. {{ users[i].criminal_3e_details }}{% endif %}</w:t>
+            </w:r>
+          </w:p>
+          <w:p>
+            <w:pPr>
+              <w:spacing w:after="0" w:line="240" w:lineRule="auto"/>
+              <w:ind w:left="82" w:right="90"/>
+            </w:pPr>
+            <w:r>
+              <w:t>{% if  users[i].criminal_3f_yes %}f. {{ users[i].criminal_3f_details }}{% endif %}</w:t>
+            </w:r>
+          </w:p>
+          <w:p>
+            <w:pPr>
+              <w:spacing w:after="0" w:line="240" w:lineRule="auto"/>
+              <w:ind w:left="82" w:right="90"/>
+            </w:pPr>
+            <w:r>
+              <w:t>{% if  users[i].criminal_3g_yes %}g. {{ users[i].criminal_3g_details }}{% endif %}</w:t>
+            </w:r>
+          </w:p>
+          <w:p>
+            <w:pPr>
+              <w:spacing w:after="0" w:line="240" w:lineRule="auto"/>
+              <w:ind w:left="82" w:right="90"/>
+            </w:pPr>
+            <w:r>
+              <w:t>{% if  users[i].criminal_3h_yes %}h. {{ users[i].criminal_3h_details }}{% endif %}</w:t>
+            </w:r>
+          </w:p>
+          <w:p>
+            <w:pPr>
+              <w:spacing w:after="0" w:line="240" w:lineRule="auto"/>
+              <w:ind w:left="82" w:right="90"/>
+            </w:pPr>
+            <w:r>
+              <w:t>{% if  users[i].criminal_3i_yes %}i. {{ users[i].criminal_3i_details }}{% endif %}</w:t>
+            </w:r>
+          </w:p>
+          <w:p>
+            <w:pPr>
+              <w:spacing w:after="0" w:line="240" w:lineRule="auto"/>
+              <w:ind w:left="82" w:right="90"/>
+            </w:pPr>
+            <w:r>
+              <w:t>{% if  users[i].criminal_3j_yes %}j. {{ users[i].criminal_3j_details }}{% endif %}</w:t>
+            </w:r>
+          </w:p>
+          <w:p>
+            <w:pPr>
+              <w:spacing w:after="0" w:line="240" w:lineRule="auto"/>
+              <w:ind w:left="82" w:right="90"/>
+            </w:pPr>
+            <w:r>
+              <w:t>{% if  users[i].criminal_3k_yes %}k. {{ users[i].criminal_3k_details }}{% endif %}</w:t>
+            </w:r>
+          </w:p>
+          <w:p>
+            <w:pPr>
+              <w:spacing w:after="0" w:line="240" w:lineRule="auto"/>
+              <w:ind w:left="720"/>
+            </w:pPr>
+          </w:p>
         </w:tc>
       </w:tr>
       <w:tr>
@@ -10937,18 +10609,9 @@
                 <w:b/>
               </w:rPr>
             </w:pPr>
-            <w:sdt>
-              <w:sdtPr>
-                <w:tag w:val="goog_rdk_143"/>
-                <w:id w:val="2146925495"/>
-                <w:showingPlcHdr/>
-              </w:sdtPr>
-              <w:sdtContent>
-                <w:r>
-                  <w:t xml:space="preserve">     </w:t>
-                </w:r>
-              </w:sdtContent>
-            </w:sdt>
+            <w:r>
+              <w:t xml:space="preserve">     </w:t>
+            </w:r>
             <w:r>
               <w:rPr>
                 <w:b/>
@@ -12114,18 +11777,9 @@
                 <w:b/>
               </w:rPr>
             </w:pPr>
-            <w:sdt>
-              <w:sdtPr>
-                <w:tag w:val="goog_rdk_143"/>
-                <w:id w:val="200679336"/>
-                <w:showingPlcHdr/>
-              </w:sdtPr>
-              <w:sdtContent>
-                <w:r>
-                  <w:t xml:space="preserve">     </w:t>
-                </w:r>
-              </w:sdtContent>
-            </w:sdt>
+            <w:r>
+              <w:t xml:space="preserve">     </w:t>
+            </w:r>
             <w:r>
               <w:rPr>
                 <w:b/>
@@ -13381,18 +13035,9 @@
                 <w:b/>
               </w:rPr>
             </w:pPr>
-            <w:sdt>
-              <w:sdtPr>
-                <w:tag w:val="goog_rdk_150"/>
-                <w:id w:val="-757976856"/>
-                <w:showingPlcHdr/>
-              </w:sdtPr>
-              <w:sdtContent>
-                <w:r>
-                  <w:t xml:space="preserve">     </w:t>
-                </w:r>
-              </w:sdtContent>
-            </w:sdt>
+            <w:r>
+              <w:t xml:space="preserve">     </w:t>
+            </w:r>
             <w:r>
               <w:rPr>
                 <w:b/>
@@ -13813,18 +13458,9 @@
               <w:spacing w:line="240" w:lineRule="auto"/>
               <w:jc w:val="center"/>
             </w:pPr>
-            <w:sdt>
-              <w:sdtPr>
-                <w:tag w:val="goog_rdk_155"/>
-                <w:id w:val="942496138"/>
-                <w:showingPlcHdr/>
-              </w:sdtPr>
-              <w:sdtContent>
-                <w:r>
-                  <w:t xml:space="preserve">     </w:t>
-                </w:r>
-              </w:sdtContent>
-            </w:sdt>
+            <w:r>
+              <w:t xml:space="preserve">     </w:t>
+            </w:r>
             <w:r>
               <w:rPr>
                 <w:b/>
@@ -14778,13 +14414,6 @@
                 <w:b/>
               </w:rPr>
             </w:pPr>
-            <w:sdt>
-              <w:sdtPr>
-                <w:tag w:val="goog_rdk_156"/>
-                <w:id w:val="118427760"/>
-              </w:sdtPr>
-              <w:sdtContent/>
-            </w:sdt>
             <w:r>
               <w:rPr>
                 <w:b/>
@@ -19904,13 +19533,6 @@
         </w:rPr>
         <w:t xml:space="preserve">SCREENER </w:t>
       </w:r>
-      <w:sdt>
-        <w:sdtPr>
-          <w:tag w:val="goog_rdk_193"/>
-          <w:id w:val="583190171"/>
-        </w:sdtPr>
-        <w:sdtContent/>
-      </w:sdt>
       <w:r>
         <w:rPr>
           <w:b/>
@@ -20025,22 +19647,14 @@
           <w:i/>
         </w:rPr>
       </w:pPr>
-      <w:sdt>
-        <w:sdtPr>
-          <w:tag w:val="goog_rdk_194"/>
-          <w:id w:val="1544251859"/>
-        </w:sdtPr>
-        <w:sdtContent>
-          <w:r>
-            <w:rPr>
-              <w:rFonts w:ascii="Arial Unicode MS" w:eastAsia="Arial Unicode MS" w:hAnsi="Arial Unicode MS" w:cs="Arial Unicode MS"/>
-              <w:sz w:val="24"/>
-              <w:szCs w:val="24"/>
-            </w:rPr>
-            <w:t>☐</w:t>
-          </w:r>
-        </w:sdtContent>
-      </w:sdt>
+      <w:r>
+        <w:rPr>
+          <w:rFonts w:ascii="Arial Unicode MS" w:eastAsia="Arial Unicode MS" w:hAnsi="Arial Unicode MS" w:cs="Arial Unicode MS"/>
+          <w:sz w:val="24"/>
+          <w:szCs w:val="24"/>
+        </w:rPr>
+        <w:t>☐</w:t>
+      </w:r>
       <w:r>
         <w:t xml:space="preserve"> </w:t>
       </w:r>
@@ -20085,22 +19699,14 @@
           <w:i/>
         </w:rPr>
       </w:pPr>
-      <w:sdt>
-        <w:sdtPr>
-          <w:tag w:val="goog_rdk_195"/>
-          <w:id w:val="659658011"/>
-        </w:sdtPr>
-        <w:sdtContent>
-          <w:r>
-            <w:rPr>
-              <w:rFonts w:ascii="Arial Unicode MS" w:eastAsia="Arial Unicode MS" w:hAnsi="Arial Unicode MS" w:cs="Arial Unicode MS"/>
-              <w:sz w:val="24"/>
-              <w:szCs w:val="24"/>
-            </w:rPr>
-            <w:t>☐</w:t>
-          </w:r>
-        </w:sdtContent>
-      </w:sdt>
+      <w:r>
+        <w:rPr>
+          <w:rFonts w:ascii="Arial Unicode MS" w:eastAsia="Arial Unicode MS" w:hAnsi="Arial Unicode MS" w:cs="Arial Unicode MS"/>
+          <w:sz w:val="24"/>
+          <w:szCs w:val="24"/>
+        </w:rPr>
+        <w:t>☐</w:t>
+      </w:r>
       <w:r>
         <w:t xml:space="preserve"> </w:t>
       </w:r>
@@ -20124,27 +19730,19 @@
       <w:pPr>
         <w:spacing w:after="0" w:line="240" w:lineRule="auto"/>
       </w:pPr>
-      <w:sdt>
-        <w:sdtPr>
-          <w:tag w:val="goog_rdk_196"/>
-          <w:id w:val="-1850097027"/>
-        </w:sdtPr>
-        <w:sdtContent>
-          <w:r>
-            <w:rPr>
-              <w:rFonts w:ascii="Arial Unicode MS" w:eastAsia="Arial Unicode MS" w:hAnsi="Arial Unicode MS" w:cs="Arial Unicode MS"/>
-              <w:sz w:val="24"/>
-              <w:szCs w:val="24"/>
-            </w:rPr>
-            <w:t>☐</w:t>
-          </w:r>
-        </w:sdtContent>
-      </w:sdt>
-      <w:r>
-        <w:rPr>
+      <w:r>
+        <w:rPr>
+          <w:rFonts w:ascii="Arial Unicode MS" w:eastAsia="Arial Unicode MS" w:hAnsi="Arial Unicode MS" w:cs="Arial Unicode MS"/>
           <w:sz w:val="24"/>
           <w:szCs w:val="24"/>
         </w:rPr>
+        <w:t>☐</w:t>
+      </w:r>
+      <w:r>
+        <w:rPr>
+          <w:sz w:val="24"/>
+          <w:szCs w:val="24"/>
+        </w:rPr>
         <w:t xml:space="preserve"> TPS</w:t>
       </w:r>
     </w:p>
@@ -20152,22 +19750,14 @@
       <w:pPr>
         <w:spacing w:after="0" w:line="240" w:lineRule="auto"/>
       </w:pPr>
-      <w:sdt>
-        <w:sdtPr>
-          <w:tag w:val="goog_rdk_197"/>
-          <w:id w:val="-1570949938"/>
-        </w:sdtPr>
-        <w:sdtContent>
-          <w:r>
-            <w:rPr>
-              <w:rFonts w:ascii="Arial Unicode MS" w:eastAsia="Arial Unicode MS" w:hAnsi="Arial Unicode MS" w:cs="Arial Unicode MS"/>
-              <w:sz w:val="24"/>
-              <w:szCs w:val="24"/>
-            </w:rPr>
-            <w:t>☐</w:t>
-          </w:r>
-        </w:sdtContent>
-      </w:sdt>
+      <w:r>
+        <w:rPr>
+          <w:rFonts w:ascii="Arial Unicode MS" w:eastAsia="Arial Unicode MS" w:hAnsi="Arial Unicode MS" w:cs="Arial Unicode MS"/>
+          <w:sz w:val="24"/>
+          <w:szCs w:val="24"/>
+        </w:rPr>
+        <w:t>☐</w:t>
+      </w:r>
       <w:r>
         <w:t xml:space="preserve"> EAD</w:t>
       </w:r>
@@ -20186,88 +19776,56 @@
       <w:r>
         <w:tab/>
       </w:r>
-      <w:sdt>
-        <w:sdtPr>
-          <w:tag w:val="goog_rdk_198"/>
-          <w:id w:val="633605138"/>
-        </w:sdtPr>
-        <w:sdtContent>
-          <w:r>
-            <w:rPr>
-              <w:rFonts w:ascii="Arial Unicode MS" w:eastAsia="Arial Unicode MS" w:hAnsi="Arial Unicode MS" w:cs="Arial Unicode MS"/>
-              <w:sz w:val="24"/>
-              <w:szCs w:val="24"/>
-            </w:rPr>
-            <w:t>☐</w:t>
-          </w:r>
-        </w:sdtContent>
-      </w:sdt>
+      <w:r>
+        <w:rPr>
+          <w:rFonts w:ascii="Arial Unicode MS" w:eastAsia="Arial Unicode MS" w:hAnsi="Arial Unicode MS" w:cs="Arial Unicode MS"/>
+          <w:sz w:val="24"/>
+          <w:szCs w:val="24"/>
+        </w:rPr>
+        <w:t>☐</w:t>
+      </w:r>
       <w:r>
         <w:t xml:space="preserve"> Parole</w:t>
       </w:r>
       <w:r>
         <w:tab/>
       </w:r>
-      <w:sdt>
-        <w:sdtPr>
-          <w:tag w:val="goog_rdk_199"/>
-          <w:id w:val="1598285880"/>
-        </w:sdtPr>
-        <w:sdtContent>
-          <w:r>
-            <w:rPr>
-              <w:rFonts w:ascii="Arial Unicode MS" w:eastAsia="Arial Unicode MS" w:hAnsi="Arial Unicode MS" w:cs="Arial Unicode MS"/>
-              <w:sz w:val="24"/>
-              <w:szCs w:val="24"/>
-            </w:rPr>
-            <w:t>☐</w:t>
-          </w:r>
-        </w:sdtContent>
-      </w:sdt>
+      <w:r>
+        <w:rPr>
+          <w:rFonts w:ascii="Arial Unicode MS" w:eastAsia="Arial Unicode MS" w:hAnsi="Arial Unicode MS" w:cs="Arial Unicode MS"/>
+          <w:sz w:val="24"/>
+          <w:szCs w:val="24"/>
+        </w:rPr>
+        <w:t>☐</w:t>
+      </w:r>
       <w:r>
         <w:t xml:space="preserve"> Pending asylum</w:t>
       </w:r>
       <w:r>
         <w:tab/>
       </w:r>
-      <w:sdt>
-        <w:sdtPr>
-          <w:tag w:val="goog_rdk_200"/>
-          <w:id w:val="574329373"/>
-        </w:sdtPr>
-        <w:sdtContent>
-          <w:r>
-            <w:rPr>
-              <w:rFonts w:ascii="Arial Unicode MS" w:eastAsia="Arial Unicode MS" w:hAnsi="Arial Unicode MS" w:cs="Arial Unicode MS"/>
-              <w:sz w:val="24"/>
-              <w:szCs w:val="24"/>
-            </w:rPr>
-            <w:t>☐</w:t>
-          </w:r>
-        </w:sdtContent>
-      </w:sdt>
+      <w:r>
+        <w:rPr>
+          <w:rFonts w:ascii="Arial Unicode MS" w:eastAsia="Arial Unicode MS" w:hAnsi="Arial Unicode MS" w:cs="Arial Unicode MS"/>
+          <w:sz w:val="24"/>
+          <w:szCs w:val="24"/>
+        </w:rPr>
+        <w:t>☐</w:t>
+      </w:r>
       <w:r>
         <w:t xml:space="preserve"> Pending/approved TPS</w:t>
       </w:r>
       <w:r>
         <w:tab/>
       </w:r>
-      <w:sdt>
-        <w:sdtPr>
-          <w:tag w:val="goog_rdk_201"/>
-          <w:id w:val="-1229833411"/>
-        </w:sdtPr>
-        <w:sdtContent>
-          <w:r>
-            <w:rPr>
-              <w:rFonts w:ascii="Arial Unicode MS" w:eastAsia="Arial Unicode MS" w:hAnsi="Arial Unicode MS" w:cs="Arial Unicode MS"/>
-              <w:sz w:val="24"/>
-              <w:szCs w:val="24"/>
-            </w:rPr>
-            <w:t>☐</w:t>
-          </w:r>
-        </w:sdtContent>
-      </w:sdt>
+      <w:r>
+        <w:rPr>
+          <w:rFonts w:ascii="Arial Unicode MS" w:eastAsia="Arial Unicode MS" w:hAnsi="Arial Unicode MS" w:cs="Arial Unicode MS"/>
+          <w:sz w:val="24"/>
+          <w:szCs w:val="24"/>
+        </w:rPr>
+        <w:t>☐</w:t>
+      </w:r>
       <w:r>
         <w:t xml:space="preserve"> Order of Supervision</w:t>
       </w:r>
@@ -20276,22 +19834,14 @@
       <w:pPr>
         <w:spacing w:after="0" w:line="240" w:lineRule="auto"/>
       </w:pPr>
-      <w:sdt>
-        <w:sdtPr>
-          <w:tag w:val="goog_rdk_202"/>
-          <w:id w:val="-718271424"/>
-        </w:sdtPr>
-        <w:sdtContent>
-          <w:r>
-            <w:rPr>
-              <w:rFonts w:ascii="Arial Unicode MS" w:eastAsia="Arial Unicode MS" w:hAnsi="Arial Unicode MS" w:cs="Arial Unicode MS"/>
-              <w:sz w:val="24"/>
-              <w:szCs w:val="24"/>
-            </w:rPr>
-            <w:t>☐</w:t>
-          </w:r>
-        </w:sdtContent>
-      </w:sdt>
+      <w:r>
+        <w:rPr>
+          <w:rFonts w:ascii="Arial Unicode MS" w:eastAsia="Arial Unicode MS" w:hAnsi="Arial Unicode MS" w:cs="Arial Unicode MS"/>
+          <w:sz w:val="24"/>
+          <w:szCs w:val="24"/>
+        </w:rPr>
+        <w:t>☐</w:t>
+      </w:r>
       <w:r>
         <w:t xml:space="preserve"> Asylum</w:t>
       </w:r>
@@ -20310,27 +19860,19 @@
       <w:r>
         <w:tab/>
       </w:r>
-      <w:sdt>
-        <w:sdtPr>
-          <w:tag w:val="goog_rdk_203"/>
-          <w:id w:val="993453009"/>
-        </w:sdtPr>
-        <w:sdtContent>
-          <w:r>
-            <w:rPr>
-              <w:rFonts w:ascii="Arial Unicode MS" w:eastAsia="Arial Unicode MS" w:hAnsi="Arial Unicode MS" w:cs="Arial Unicode MS"/>
-              <w:sz w:val="24"/>
-              <w:szCs w:val="24"/>
-            </w:rPr>
-            <w:t>☐</w:t>
-          </w:r>
-        </w:sdtContent>
-      </w:sdt>
-      <w:r>
-        <w:rPr>
+      <w:r>
+        <w:rPr>
+          <w:rFonts w:ascii="Arial Unicode MS" w:eastAsia="Arial Unicode MS" w:hAnsi="Arial Unicode MS" w:cs="Arial Unicode MS"/>
           <w:sz w:val="24"/>
           <w:szCs w:val="24"/>
         </w:rPr>
+        <w:t>☐</w:t>
+      </w:r>
+      <w:r>
+        <w:rPr>
+          <w:sz w:val="24"/>
+          <w:szCs w:val="24"/>
+        </w:rPr>
         <w:t xml:space="preserve"> </w:t>
       </w:r>
       <w:r>
@@ -20345,27 +19887,19 @@
         <w:spacing w:after="0" w:line="240" w:lineRule="auto"/>
         <w:ind w:left="2160" w:firstLine="720"/>
       </w:pPr>
-      <w:sdt>
-        <w:sdtPr>
-          <w:tag w:val="goog_rdk_204"/>
-          <w:id w:val="927159966"/>
-        </w:sdtPr>
-        <w:sdtContent>
-          <w:r>
-            <w:rPr>
-              <w:rFonts w:ascii="Arial Unicode MS" w:eastAsia="Arial Unicode MS" w:hAnsi="Arial Unicode MS" w:cs="Arial Unicode MS"/>
-              <w:sz w:val="24"/>
-              <w:szCs w:val="24"/>
-            </w:rPr>
-            <w:t>☐</w:t>
-          </w:r>
-        </w:sdtContent>
-      </w:sdt>
-      <w:r>
-        <w:rPr>
+      <w:r>
+        <w:rPr>
+          <w:rFonts w:ascii="Arial Unicode MS" w:eastAsia="Arial Unicode MS" w:hAnsi="Arial Unicode MS" w:cs="Arial Unicode MS"/>
           <w:sz w:val="24"/>
           <w:szCs w:val="24"/>
         </w:rPr>
+        <w:t>☐</w:t>
+      </w:r>
+      <w:r>
+        <w:rPr>
+          <w:sz w:val="24"/>
+          <w:szCs w:val="24"/>
+        </w:rPr>
         <w:t xml:space="preserve"> </w:t>
       </w:r>
       <w:r>
@@ -20392,27 +19926,19 @@
       <w:r>
         <w:tab/>
       </w:r>
-      <w:sdt>
-        <w:sdtPr>
-          <w:tag w:val="goog_rdk_205"/>
-          <w:id w:val="1414361535"/>
-        </w:sdtPr>
-        <w:sdtContent>
-          <w:r>
-            <w:rPr>
-              <w:rFonts w:ascii="Arial Unicode MS" w:eastAsia="Arial Unicode MS" w:hAnsi="Arial Unicode MS" w:cs="Arial Unicode MS"/>
-              <w:sz w:val="24"/>
-              <w:szCs w:val="24"/>
-            </w:rPr>
-            <w:t>☐</w:t>
-          </w:r>
-        </w:sdtContent>
-      </w:sdt>
-      <w:r>
-        <w:rPr>
+      <w:r>
+        <w:rPr>
+          <w:rFonts w:ascii="Arial Unicode MS" w:eastAsia="Arial Unicode MS" w:hAnsi="Arial Unicode MS" w:cs="Arial Unicode MS"/>
           <w:sz w:val="24"/>
           <w:szCs w:val="24"/>
         </w:rPr>
+        <w:t>☐</w:t>
+      </w:r>
+      <w:r>
+        <w:rPr>
+          <w:sz w:val="24"/>
+          <w:szCs w:val="24"/>
+        </w:rPr>
         <w:t xml:space="preserve"> </w:t>
       </w:r>
       <w:r>
@@ -20424,27 +19950,19 @@
         <w:spacing w:after="0" w:line="240" w:lineRule="auto"/>
         <w:ind w:firstLine="720"/>
       </w:pPr>
-      <w:sdt>
-        <w:sdtPr>
-          <w:tag w:val="goog_rdk_206"/>
-          <w:id w:val="53056826"/>
-        </w:sdtPr>
-        <w:sdtContent>
-          <w:r>
-            <w:rPr>
-              <w:rFonts w:ascii="Arial Unicode MS" w:eastAsia="Arial Unicode MS" w:hAnsi="Arial Unicode MS" w:cs="Arial Unicode MS"/>
-              <w:sz w:val="24"/>
-              <w:szCs w:val="24"/>
-            </w:rPr>
-            <w:t>☐</w:t>
-          </w:r>
-        </w:sdtContent>
-      </w:sdt>
-      <w:r>
-        <w:rPr>
+      <w:r>
+        <w:rPr>
+          <w:rFonts w:ascii="Arial Unicode MS" w:eastAsia="Arial Unicode MS" w:hAnsi="Arial Unicode MS" w:cs="Arial Unicode MS"/>
           <w:sz w:val="24"/>
           <w:szCs w:val="24"/>
         </w:rPr>
+        <w:t>☐</w:t>
+      </w:r>
+      <w:r>
+        <w:rPr>
+          <w:sz w:val="24"/>
+          <w:szCs w:val="24"/>
+        </w:rPr>
         <w:t xml:space="preserve"> </w:t>
       </w:r>
       <w:r>
@@ -20456,27 +19974,19 @@
         <w:spacing w:after="0" w:line="240" w:lineRule="auto"/>
         <w:ind w:firstLine="720"/>
       </w:pPr>
-      <w:sdt>
-        <w:sdtPr>
-          <w:tag w:val="goog_rdk_207"/>
-          <w:id w:val="887379623"/>
-        </w:sdtPr>
-        <w:sdtContent>
-          <w:r>
-            <w:rPr>
-              <w:rFonts w:ascii="Arial Unicode MS" w:eastAsia="Arial Unicode MS" w:hAnsi="Arial Unicode MS" w:cs="Arial Unicode MS"/>
-              <w:sz w:val="24"/>
-              <w:szCs w:val="24"/>
-            </w:rPr>
-            <w:t>☐</w:t>
-          </w:r>
-        </w:sdtContent>
-      </w:sdt>
-      <w:r>
-        <w:rPr>
+      <w:r>
+        <w:rPr>
+          <w:rFonts w:ascii="Arial Unicode MS" w:eastAsia="Arial Unicode MS" w:hAnsi="Arial Unicode MS" w:cs="Arial Unicode MS"/>
           <w:sz w:val="24"/>
           <w:szCs w:val="24"/>
         </w:rPr>
+        <w:t>☐</w:t>
+      </w:r>
+      <w:r>
+        <w:rPr>
+          <w:sz w:val="24"/>
+          <w:szCs w:val="24"/>
+        </w:rPr>
         <w:t xml:space="preserve"> </w:t>
       </w:r>
       <w:r>
@@ -20488,22 +19998,14 @@
         <w:spacing w:after="0" w:line="240" w:lineRule="auto"/>
         <w:ind w:firstLine="720"/>
       </w:pPr>
-      <w:sdt>
-        <w:sdtPr>
-          <w:tag w:val="goog_rdk_208"/>
-          <w:id w:val="-1866128278"/>
-        </w:sdtPr>
-        <w:sdtContent>
-          <w:r>
-            <w:rPr>
-              <w:rFonts w:ascii="Arial Unicode MS" w:eastAsia="Arial Unicode MS" w:hAnsi="Arial Unicode MS" w:cs="Arial Unicode MS"/>
-              <w:sz w:val="24"/>
-              <w:szCs w:val="24"/>
-            </w:rPr>
-            <w:t>☐</w:t>
-          </w:r>
-        </w:sdtContent>
-      </w:sdt>
+      <w:r>
+        <w:rPr>
+          <w:rFonts w:ascii="Arial Unicode MS" w:eastAsia="Arial Unicode MS" w:hAnsi="Arial Unicode MS" w:cs="Arial Unicode MS"/>
+          <w:sz w:val="24"/>
+          <w:szCs w:val="24"/>
+        </w:rPr>
+        <w:t>☐</w:t>
+      </w:r>
       <w:r>
         <w:t xml:space="preserve"> Political opinion</w:t>
       </w:r>
@@ -20513,27 +20015,19 @@
         <w:spacing w:after="0" w:line="240" w:lineRule="auto"/>
         <w:ind w:firstLine="720"/>
       </w:pPr>
-      <w:sdt>
-        <w:sdtPr>
-          <w:tag w:val="goog_rdk_209"/>
-          <w:id w:val="1267649574"/>
-        </w:sdtPr>
-        <w:sdtContent>
-          <w:r>
-            <w:rPr>
-              <w:rFonts w:ascii="Arial Unicode MS" w:eastAsia="Arial Unicode MS" w:hAnsi="Arial Unicode MS" w:cs="Arial Unicode MS"/>
-              <w:sz w:val="24"/>
-              <w:szCs w:val="24"/>
-            </w:rPr>
-            <w:t>☐</w:t>
-          </w:r>
-        </w:sdtContent>
-      </w:sdt>
-      <w:r>
-        <w:rPr>
+      <w:r>
+        <w:rPr>
+          <w:rFonts w:ascii="Arial Unicode MS" w:eastAsia="Arial Unicode MS" w:hAnsi="Arial Unicode MS" w:cs="Arial Unicode MS"/>
           <w:sz w:val="24"/>
           <w:szCs w:val="24"/>
         </w:rPr>
+        <w:t>☐</w:t>
+      </w:r>
+      <w:r>
+        <w:rPr>
+          <w:sz w:val="24"/>
+          <w:szCs w:val="24"/>
+        </w:rPr>
         <w:t xml:space="preserve"> </w:t>
       </w:r>
       <w:r>
@@ -20554,27 +20048,19 @@
         <w:spacing w:after="0" w:line="240" w:lineRule="auto"/>
         <w:ind w:left="2880"/>
       </w:pPr>
-      <w:sdt>
-        <w:sdtPr>
-          <w:tag w:val="goog_rdk_210"/>
-          <w:id w:val="834726983"/>
-        </w:sdtPr>
-        <w:sdtContent>
-          <w:r>
-            <w:rPr>
-              <w:rFonts w:ascii="Arial Unicode MS" w:eastAsia="Arial Unicode MS" w:hAnsi="Arial Unicode MS" w:cs="Arial Unicode MS"/>
-              <w:sz w:val="24"/>
-              <w:szCs w:val="24"/>
-            </w:rPr>
-            <w:t>☐</w:t>
-          </w:r>
-        </w:sdtContent>
-      </w:sdt>
-      <w:r>
-        <w:rPr>
+      <w:r>
+        <w:rPr>
+          <w:rFonts w:ascii="Arial Unicode MS" w:eastAsia="Arial Unicode MS" w:hAnsi="Arial Unicode MS" w:cs="Arial Unicode MS"/>
           <w:sz w:val="24"/>
           <w:szCs w:val="24"/>
         </w:rPr>
+        <w:t>☐</w:t>
+      </w:r>
+      <w:r>
+        <w:rPr>
+          <w:sz w:val="24"/>
+          <w:szCs w:val="24"/>
+        </w:rPr>
         <w:t xml:space="preserve"> </w:t>
       </w:r>
       <w:r>
@@ -20623,44 +20109,28 @@
       <w:r>
         <w:tab/>
       </w:r>
-      <w:sdt>
-        <w:sdtPr>
-          <w:tag w:val="goog_rdk_211"/>
-          <w:id w:val="-589151597"/>
-        </w:sdtPr>
-        <w:sdtContent>
-          <w:r>
-            <w:rPr>
-              <w:rFonts w:ascii="Arial Unicode MS" w:eastAsia="Arial Unicode MS" w:hAnsi="Arial Unicode MS" w:cs="Arial Unicode MS"/>
-              <w:sz w:val="24"/>
-              <w:szCs w:val="24"/>
-            </w:rPr>
-            <w:t>☐</w:t>
-          </w:r>
-        </w:sdtContent>
-      </w:sdt>
+      <w:r>
+        <w:rPr>
+          <w:rFonts w:ascii="Arial Unicode MS" w:eastAsia="Arial Unicode MS" w:hAnsi="Arial Unicode MS" w:cs="Arial Unicode MS"/>
+          <w:sz w:val="24"/>
+          <w:szCs w:val="24"/>
+        </w:rPr>
+        <w:t>☐</w:t>
+      </w:r>
       <w:r>
         <w:t xml:space="preserve"> Yes</w:t>
       </w:r>
       <w:r>
         <w:tab/>
       </w:r>
-      <w:sdt>
-        <w:sdtPr>
-          <w:tag w:val="goog_rdk_212"/>
-          <w:id w:val="1399317234"/>
-        </w:sdtPr>
-        <w:sdtContent>
-          <w:r>
-            <w:rPr>
-              <w:rFonts w:ascii="Arial Unicode MS" w:eastAsia="Arial Unicode MS" w:hAnsi="Arial Unicode MS" w:cs="Arial Unicode MS"/>
-              <w:sz w:val="24"/>
-              <w:szCs w:val="24"/>
-            </w:rPr>
-            <w:t>☐</w:t>
-          </w:r>
-        </w:sdtContent>
-      </w:sdt>
+      <w:r>
+        <w:rPr>
+          <w:rFonts w:ascii="Arial Unicode MS" w:eastAsia="Arial Unicode MS" w:hAnsi="Arial Unicode MS" w:cs="Arial Unicode MS"/>
+          <w:sz w:val="24"/>
+          <w:szCs w:val="24"/>
+        </w:rPr>
+        <w:t>☐</w:t>
+      </w:r>
       <w:r>
         <w:t xml:space="preserve"> No</w:t>
       </w:r>
@@ -20727,22 +20197,14 @@
           <w:i/>
         </w:rPr>
       </w:pPr>
-      <w:sdt>
-        <w:sdtPr>
-          <w:tag w:val="goog_rdk_213"/>
-          <w:id w:val="-1066337848"/>
-        </w:sdtPr>
-        <w:sdtContent>
-          <w:r>
-            <w:rPr>
-              <w:rFonts w:ascii="Arial Unicode MS" w:eastAsia="Arial Unicode MS" w:hAnsi="Arial Unicode MS" w:cs="Arial Unicode MS"/>
-              <w:sz w:val="24"/>
-              <w:szCs w:val="24"/>
-            </w:rPr>
-            <w:t>☐</w:t>
-          </w:r>
-        </w:sdtContent>
-      </w:sdt>
+      <w:r>
+        <w:rPr>
+          <w:rFonts w:ascii="Arial Unicode MS" w:eastAsia="Arial Unicode MS" w:hAnsi="Arial Unicode MS" w:cs="Arial Unicode MS"/>
+          <w:sz w:val="24"/>
+          <w:szCs w:val="24"/>
+        </w:rPr>
+        <w:t>☐</w:t>
+      </w:r>
       <w:r>
         <w:t xml:space="preserve"> </w:t>
       </w:r>
@@ -20777,22 +20239,14 @@
           <w:i/>
         </w:rPr>
       </w:pPr>
-      <w:sdt>
-        <w:sdtPr>
-          <w:tag w:val="goog_rdk_214"/>
-          <w:id w:val="-869613339"/>
-        </w:sdtPr>
-        <w:sdtContent>
-          <w:r>
-            <w:rPr>
-              <w:rFonts w:ascii="Arial Unicode MS" w:eastAsia="Arial Unicode MS" w:hAnsi="Arial Unicode MS" w:cs="Arial Unicode MS"/>
-              <w:sz w:val="24"/>
-              <w:szCs w:val="24"/>
-            </w:rPr>
-            <w:t>☐</w:t>
-          </w:r>
-        </w:sdtContent>
-      </w:sdt>
+      <w:r>
+        <w:rPr>
+          <w:rFonts w:ascii="Arial Unicode MS" w:eastAsia="Arial Unicode MS" w:hAnsi="Arial Unicode MS" w:cs="Arial Unicode MS"/>
+          <w:sz w:val="24"/>
+          <w:szCs w:val="24"/>
+        </w:rPr>
+        <w:t>☐</w:t>
+      </w:r>
       <w:r>
         <w:t xml:space="preserve"> </w:t>
       </w:r>
@@ -21027,13 +20481,6 @@
         </w:rPr>
         <w:t xml:space="preserve">Legal Screening Summary for </w:t>
       </w:r>
-      <w:sdt>
-        <w:sdtPr>
-          <w:tag w:val="goog_rdk_215"/>
-          <w:id w:val="-2074342159"/>
-        </w:sdtPr>
-        <w:sdtContent/>
-      </w:sdt>
       <w:r>
         <w:rPr>
           <w:b/>
@@ -21241,22 +20688,14 @@
           <w:color w:val="000000"/>
         </w:rPr>
       </w:pPr>
-      <w:sdt>
-        <w:sdtPr>
-          <w:tag w:val="goog_rdk_216"/>
-          <w:id w:val="1006940951"/>
-        </w:sdtPr>
-        <w:sdtContent>
-          <w:r>
-            <w:rPr>
-              <w:rFonts w:ascii="Arial Unicode MS" w:eastAsia="Arial Unicode MS" w:hAnsi="Arial Unicode MS" w:cs="Arial Unicode MS"/>
-              <w:b/>
-              <w:color w:val="000000"/>
-            </w:rPr>
-            <w:t>☐</w:t>
-          </w:r>
-        </w:sdtContent>
-      </w:sdt>
+      <w:r>
+        <w:rPr>
+          <w:rFonts w:ascii="Arial Unicode MS" w:eastAsia="Arial Unicode MS" w:hAnsi="Arial Unicode MS" w:cs="Arial Unicode MS"/>
+          <w:b/>
+          <w:color w:val="000000"/>
+        </w:rPr>
+        <w:t>☐</w:t>
+      </w:r>
       <w:r>
         <w:rPr>
           <w:b/>
@@ -21307,22 +20746,14 @@
           <w:color w:val="000000"/>
         </w:rPr>
       </w:pPr>
-      <w:sdt>
-        <w:sdtPr>
-          <w:tag w:val="goog_rdk_217"/>
-          <w:id w:val="-870917593"/>
-        </w:sdtPr>
-        <w:sdtContent>
-          <w:r>
-            <w:rPr>
-              <w:rFonts w:ascii="Arial Unicode MS" w:eastAsia="Arial Unicode MS" w:hAnsi="Arial Unicode MS" w:cs="Arial Unicode MS"/>
-              <w:b/>
-              <w:color w:val="000000"/>
-            </w:rPr>
-            <w:t>☐</w:t>
-          </w:r>
-        </w:sdtContent>
-      </w:sdt>
+      <w:r>
+        <w:rPr>
+          <w:rFonts w:ascii="Arial Unicode MS" w:eastAsia="Arial Unicode MS" w:hAnsi="Arial Unicode MS" w:cs="Arial Unicode MS"/>
+          <w:b/>
+          <w:color w:val="000000"/>
+        </w:rPr>
+        <w:t>☐</w:t>
+      </w:r>
       <w:r>
         <w:rPr>
           <w:b/>
@@ -21414,22 +20845,14 @@
           <w:color w:val="000000"/>
         </w:rPr>
       </w:pPr>
-      <w:sdt>
-        <w:sdtPr>
-          <w:tag w:val="goog_rdk_218"/>
-          <w:id w:val="-2120203958"/>
-        </w:sdtPr>
-        <w:sdtContent>
-          <w:r>
-            <w:rPr>
-              <w:rFonts w:ascii="Arial Unicode MS" w:eastAsia="Arial Unicode MS" w:hAnsi="Arial Unicode MS" w:cs="Arial Unicode MS"/>
-              <w:b/>
-              <w:color w:val="000000"/>
-            </w:rPr>
-            <w:t>☐</w:t>
-          </w:r>
-        </w:sdtContent>
-      </w:sdt>
+      <w:r>
+        <w:rPr>
+          <w:rFonts w:ascii="Arial Unicode MS" w:eastAsia="Arial Unicode MS" w:hAnsi="Arial Unicode MS" w:cs="Arial Unicode MS"/>
+          <w:b/>
+          <w:color w:val="000000"/>
+        </w:rPr>
+        <w:t>☐</w:t>
+      </w:r>
       <w:r>
         <w:rPr>
           <w:b/>
@@ -21502,22 +20925,14 @@
           <w:color w:val="000000"/>
         </w:rPr>
       </w:pPr>
-      <w:sdt>
-        <w:sdtPr>
-          <w:tag w:val="goog_rdk_219"/>
-          <w:id w:val="117418073"/>
-        </w:sdtPr>
-        <w:sdtContent>
-          <w:r>
-            <w:rPr>
-              <w:rFonts w:ascii="Arial Unicode MS" w:eastAsia="Arial Unicode MS" w:hAnsi="Arial Unicode MS" w:cs="Arial Unicode MS"/>
-              <w:b/>
-              <w:color w:val="000000"/>
-            </w:rPr>
-            <w:t>☐</w:t>
-          </w:r>
-        </w:sdtContent>
-      </w:sdt>
+      <w:r>
+        <w:rPr>
+          <w:rFonts w:ascii="Arial Unicode MS" w:eastAsia="Arial Unicode MS" w:hAnsi="Arial Unicode MS" w:cs="Arial Unicode MS"/>
+          <w:b/>
+          <w:color w:val="000000"/>
+        </w:rPr>
+        <w:t>☐</w:t>
+      </w:r>
       <w:r>
         <w:rPr>
           <w:b/>
@@ -21889,20 +21304,12 @@
       <w:pPr>
         <w:spacing w:after="160" w:line="259" w:lineRule="auto"/>
       </w:pPr>
-      <w:sdt>
-        <w:sdtPr>
-          <w:tag w:val="goog_rdk_220"/>
-          <w:id w:val="1143779246"/>
-        </w:sdtPr>
-        <w:sdtContent>
-          <w:r>
-            <w:rPr>
-              <w:rFonts w:ascii="Arial Unicode MS" w:eastAsia="Arial Unicode MS" w:hAnsi="Arial Unicode MS" w:cs="Arial Unicode MS"/>
-            </w:rPr>
-            <w:t>☐</w:t>
-          </w:r>
-        </w:sdtContent>
-      </w:sdt>
+      <w:r>
+        <w:rPr>
+          <w:rFonts w:ascii="Arial Unicode MS" w:eastAsia="Arial Unicode MS" w:hAnsi="Arial Unicode MS" w:cs="Arial Unicode MS"/>
+        </w:rPr>
+        <w:t>☐</w:t>
+      </w:r>
       <w:r>
         <w:t xml:space="preserve"> </w:t>
       </w:r>
@@ -21921,20 +21328,12 @@
       <w:pPr>
         <w:spacing w:after="160" w:line="259" w:lineRule="auto"/>
       </w:pPr>
-      <w:sdt>
-        <w:sdtPr>
-          <w:tag w:val="goog_rdk_221"/>
-          <w:id w:val="357862901"/>
-        </w:sdtPr>
-        <w:sdtContent>
-          <w:r>
-            <w:rPr>
-              <w:rFonts w:ascii="Arial Unicode MS" w:eastAsia="Arial Unicode MS" w:hAnsi="Arial Unicode MS" w:cs="Arial Unicode MS"/>
-            </w:rPr>
-            <w:t>☐</w:t>
-          </w:r>
-        </w:sdtContent>
-      </w:sdt>
+      <w:r>
+        <w:rPr>
+          <w:rFonts w:ascii="Arial Unicode MS" w:eastAsia="Arial Unicode MS" w:hAnsi="Arial Unicode MS" w:cs="Arial Unicode MS"/>
+        </w:rPr>
+        <w:t>☐</w:t>
+      </w:r>
       <w:r>
         <w:t xml:space="preserve"> </w:t>
       </w:r>
@@ -21976,20 +21375,12 @@
       <w:pPr>
         <w:spacing w:after="160" w:line="259" w:lineRule="auto"/>
       </w:pPr>
-      <w:sdt>
-        <w:sdtPr>
-          <w:tag w:val="goog_rdk_222"/>
-          <w:id w:val="1535775275"/>
-        </w:sdtPr>
-        <w:sdtContent>
-          <w:r>
-            <w:rPr>
-              <w:rFonts w:ascii="Arial Unicode MS" w:eastAsia="Arial Unicode MS" w:hAnsi="Arial Unicode MS" w:cs="Arial Unicode MS"/>
-            </w:rPr>
-            <w:t>☐</w:t>
-          </w:r>
-        </w:sdtContent>
-      </w:sdt>
+      <w:r>
+        <w:rPr>
+          <w:rFonts w:ascii="Arial Unicode MS" w:eastAsia="Arial Unicode MS" w:hAnsi="Arial Unicode MS" w:cs="Arial Unicode MS"/>
+        </w:rPr>
+        <w:t>☐</w:t>
+      </w:r>
       <w:r>
         <w:t xml:space="preserve"> </w:t>
       </w:r>
@@ -22015,20 +21406,12 @@
       <w:pPr>
         <w:spacing w:after="160" w:line="259" w:lineRule="auto"/>
       </w:pPr>
-      <w:sdt>
-        <w:sdtPr>
-          <w:tag w:val="goog_rdk_223"/>
-          <w:id w:val="1280844668"/>
-        </w:sdtPr>
-        <w:sdtContent>
-          <w:r>
-            <w:rPr>
-              <w:rFonts w:ascii="Arial Unicode MS" w:eastAsia="Arial Unicode MS" w:hAnsi="Arial Unicode MS" w:cs="Arial Unicode MS"/>
-            </w:rPr>
-            <w:t>☐</w:t>
-          </w:r>
-        </w:sdtContent>
-      </w:sdt>
+      <w:r>
+        <w:rPr>
+          <w:rFonts w:ascii="Arial Unicode MS" w:eastAsia="Arial Unicode MS" w:hAnsi="Arial Unicode MS" w:cs="Arial Unicode MS"/>
+        </w:rPr>
+        <w:t>☐</w:t>
+      </w:r>
       <w:r>
         <w:t xml:space="preserve"> </w:t>
       </w:r>

</xml_diff>

<commit_message>
Updated formatting comp screener DOCX for SIJS section.
</commit_message>
<xml_diff>
--- a/docassemble/USCISApplications/data/templates/Comp_legal_screener.docx
+++ b/docassemble/USCISApplications/data/templates/Comp_legal_screener.docx
@@ -287,9 +287,9 @@
               <w:t xml:space="preserve"> and it is important that you provide true and accurate information to determine how to best assist and protect you. </w:t>
             </w:r>
           </w:p>
-          <w:bookmarkStart w:id="0" w:name="_heading=h.gjdgxs" w:colFirst="0" w:colLast="0"/>
-          <w:bookmarkEnd w:id="0"/>
-          <w:p>
+          <w:p>
+            <w:bookmarkStart w:id="0" w:name="_heading=h.gjdgxs" w:colFirst="0" w:colLast="0"/>
+            <w:bookmarkEnd w:id="0"/>
             <w:r>
               <w:t>{{ output_checkbox(</w:t>
             </w:r>
@@ -442,13 +442,7 @@
               <w:rPr>
                 <w:b/>
               </w:rPr>
-              <w:t xml:space="preserve">BASIC </w:t>
-            </w:r>
-            <w:r>
-              <w:rPr>
-                <w:b/>
-              </w:rPr>
-              <w:t>INFORMATION</w:t>
+              <w:t>BASIC INFORMATION</w:t>
             </w:r>
           </w:p>
         </w:tc>
@@ -1235,6 +1229,7 @@
               <w:rPr>
                 <w:b/>
               </w:rPr>
+              <w:lastRenderedPageBreak/>
               <w:t xml:space="preserve">Current Immigration Legal Representative?  </w:t>
             </w:r>
             <w:r>
@@ -1414,10 +1409,7 @@
               <w:t>users[i].</w:t>
             </w:r>
             <w:r>
-              <w:t>options == ‘mc’)  }}</w:t>
-            </w:r>
-            <w:r>
-              <w:t>MC</w:t>
+              <w:t>options == ‘mc’)  }}MC</w:t>
             </w:r>
             <w:r>
               <w:t xml:space="preserve"> </w:t>
@@ -1429,10 +1421,7 @@
               <w:t>users[i].</w:t>
             </w:r>
             <w:r>
-              <w:t>options == ‘indv’)  }}</w:t>
-            </w:r>
-            <w:r>
-              <w:t>INDV</w:t>
+              <w:t>options == ‘indv’)  }}INDV</w:t>
             </w:r>
             <w:r>
               <w:t xml:space="preserve"> </w:t>
@@ -1447,13 +1436,7 @@
               <w:t>users[i].</w:t>
             </w:r>
             <w:r>
-              <w:t>options == ‘bond’)  }}</w:t>
-            </w:r>
-            <w:r>
-              <w:t>Bon</w:t>
-            </w:r>
-            <w:r>
-              <w:t>d</w:t>
+              <w:t>options == ‘bond’)  }}Bond</w:t>
             </w:r>
             <w:r>
               <w:t xml:space="preserve"> </w:t>
@@ -1471,10 +1454,7 @@
               <w:t>’</w:t>
             </w:r>
             <w:r>
-              <w:t>)  }}</w:t>
-            </w:r>
-            <w:r>
-              <w:t xml:space="preserve"> Don’t know</w:t>
+              <w:t>)  }} Don’t know</w:t>
             </w:r>
           </w:p>
         </w:tc>
@@ -2416,11 +2396,11 @@
               <w:t xml:space="preserve"> == False</w:t>
             </w:r>
             <w:r>
-              <w:t>) }}  No  {{ output_checkbox(use</w:t>
+              <w:t xml:space="preserve">) }}  No  {{ </w:t>
             </w:r>
             <w:r>
               <w:lastRenderedPageBreak/>
-              <w:t>rs[i].immigration_1c_yes is none) }} IDK</w:t>
+              <w:t>output_checkbox(users[i].immigration_1c_yes is none) }} IDK</w:t>
             </w:r>
           </w:p>
         </w:tc>
@@ -2870,11 +2850,11 @@
               <w:t xml:space="preserve"> == False</w:t>
             </w:r>
             <w:r>
-              <w:t>) }}  No  {{ output_checkbox(use</w:t>
+              <w:t xml:space="preserve">) }}  No  {{ </w:t>
             </w:r>
             <w:r>
               <w:lastRenderedPageBreak/>
-              <w:t>rs[i].immigration_1h_yes is none) }} IDK</w:t>
+              <w:t>output_checkbox(users[i].immigration_1h_yes is none) }} IDK</w:t>
             </w:r>
           </w:p>
         </w:tc>
@@ -3294,11 +3274,11 @@
               <w:t xml:space="preserve"> == False</w:t>
             </w:r>
             <w:r>
-              <w:t xml:space="preserve">) }}  No  {{ </w:t>
+              <w:t xml:space="preserve">) }}  No  </w:t>
             </w:r>
             <w:r>
               <w:lastRenderedPageBreak/>
-              <w:t>output_checkbox(users[i].immigration_1m_yes is none) }} IDK</w:t>
+              <w:t>{{ output_checkbox(users[i].immigration_1m_yes is none) }} IDK</w:t>
             </w:r>
           </w:p>
         </w:tc>
@@ -3715,6 +3695,7 @@
               <w:ind w:left="120"/>
             </w:pPr>
             <w:r>
+              <w:lastRenderedPageBreak/>
               <w:t>{% if users[i].immigration_1c_yes or users[i].immigration_1c_yes is none %}c. {{ users[i].immigration_1c_details }} {% endif %}</w:t>
             </w:r>
           </w:p>
@@ -3724,7 +3705,6 @@
               <w:ind w:left="120"/>
             </w:pPr>
             <w:r>
-              <w:lastRenderedPageBreak/>
               <w:t>{% if users[i].immigration_1d_yes or users[i].immigration_1d_yes is none %}d. {{ users[i].immigration_1d_details }} {% endif %}</w:t>
             </w:r>
           </w:p>
@@ -4077,7 +4057,11 @@
               <w:t xml:space="preserve"> == False</w:t>
             </w:r>
             <w:r>
-              <w:t>) }}  No  {{ output_checkbox(users[i].application_2b_yes is none) }} IDK</w:t>
+              <w:t>) }}  No  {{ output_checkbox(use</w:t>
+            </w:r>
+            <w:r>
+              <w:lastRenderedPageBreak/>
+              <w:t>rs[i].application_2b_yes is none) }} IDK</w:t>
             </w:r>
           </w:p>
         </w:tc>
@@ -4164,11 +4148,7 @@
             <w:bookmarkStart w:id="15" w:name="_heading=h.44sinio" w:colFirst="0" w:colLast="0"/>
             <w:bookmarkEnd w:id="15"/>
             <w:r>
-              <w:t>{{ output_checkbox(use</w:t>
-            </w:r>
-            <w:r>
-              <w:lastRenderedPageBreak/>
-              <w:t>rs[i].application_2c_yes ) }} Yes  {{ output_checkbox(users[i].application_2c_yes</w:t>
+              <w:t>{{ output_checkbox(users[i].application_2c_yes ) }} Yes  {{ output_checkbox(users[i].application_2c_yes</w:t>
             </w:r>
             <w:r>
               <w:t xml:space="preserve"> == False</w:t>
@@ -6116,13 +6096,7 @@
               <w:ind w:left="442"/>
             </w:pPr>
             <w:r>
-              <w:t xml:space="preserve">Have you ever been fingerprinted </w:t>
-            </w:r>
-            <w:r>
-              <w:t xml:space="preserve">or had your picture taken </w:t>
-            </w:r>
-            <w:r>
-              <w:t>by the police (other than an immigration officer)?</w:t>
+              <w:t>Have you ever been fingerprinted or had your picture taken by the police (other than an immigration officer)?</w:t>
             </w:r>
           </w:p>
         </w:tc>
@@ -6472,10 +6446,7 @@
               <w:ind w:left="442"/>
             </w:pPr>
             <w:r>
-              <w:t>Have you ever been involved or associated with any gangs, in the U.S. or any other country?</w:t>
-            </w:r>
-            <w:r>
-              <w:t xml:space="preserve"> Or accused of being involved with a gang?</w:t>
+              <w:t>Have you ever been involved or associated with any gangs, in the U.S. or any other country? Or accused of being involved with a gang?</w:t>
             </w:r>
           </w:p>
         </w:tc>
@@ -6532,13 +6503,7 @@
             </w:pPr>
             <w:r>
               <w:lastRenderedPageBreak/>
-              <w:t xml:space="preserve">Have you ever been friends with </w:t>
-            </w:r>
-            <w:r>
-              <w:t xml:space="preserve">or have family members who are </w:t>
-            </w:r>
-            <w:r>
-              <w:t>known gang members, in the U.S. or any other country?</w:t>
+              <w:t>Have you ever been friends with or have family members who are known gang members, in the U.S. or any other country?</w:t>
             </w:r>
           </w:p>
         </w:tc>
@@ -9094,11 +9059,7 @@
               <w:jc w:val="center"/>
             </w:pPr>
             <w:r>
-              <w:t>{{ output_checkbox(user</w:t>
-            </w:r>
-            <w:r>
-              <w:lastRenderedPageBreak/>
-              <w:t>s[i].uvisa_5g_yes) }} YES  {{ output_checkbox(not users[i].uvisa_5g_yes) }} NO</w:t>
+              <w:t>{{ output_checkbox(users[i].uvisa_5g_yes) }} YES  {{ output_checkbox(not users[i].uvisa_5g_yes) }} NO</w:t>
             </w:r>
           </w:p>
         </w:tc>
@@ -9700,7 +9661,11 @@
               <w:jc w:val="center"/>
             </w:pPr>
             <w:r>
-              <w:t>{{ output_checkbox(users[i].tvisa_6b_yes) }} YES  {{ output_checkbox(not users[i].tvisa_6b_yes) }} NO</w:t>
+              <w:t xml:space="preserve">{{ output_checkbox(users[i].tvisa_6b_yes) }} YES  {{ output_checkbox(not </w:t>
+            </w:r>
+            <w:r>
+              <w:lastRenderedPageBreak/>
+              <w:t>users[i].tvisa_6b_yes) }} NO</w:t>
             </w:r>
           </w:p>
         </w:tc>
@@ -9785,11 +9750,7 @@
               <w:jc w:val="center"/>
             </w:pPr>
             <w:r>
-              <w:t>{{ output_checkbox(user</w:t>
-            </w:r>
-            <w:r>
-              <w:lastRenderedPageBreak/>
-              <w:t>s[i].tvisa_6c_yes) }} YES  {{ output_checkbox(not users[i].tvisa_6c_yes) }} NO</w:t>
+              <w:t>{{ output_checkbox(users[i].tvisa_6c_yes) }} YES  {{ output_checkbox(not users[i].tvisa_6c_yes) }} NO</w:t>
             </w:r>
           </w:p>
         </w:tc>
@@ -10362,7 +10323,6 @@
               <w:ind w:left="130"/>
             </w:pPr>
             <w:r>
-              <w:lastRenderedPageBreak/>
               <w:t>{%p if users[i].tvisa_6d_yes %}</w:t>
             </w:r>
           </w:p>
@@ -10506,7 +10466,9 @@
         <w:pStyle w:val="NoSpacing"/>
       </w:pPr>
       <w:r>
-        <w:lastRenderedPageBreak/>
+        <w:br/>
+      </w:r>
+      <w:r>
         <w:t xml:space="preserve">{%p </w:t>
       </w:r>
       <w:r>
@@ -10534,7 +10496,13 @@
         <w:t>].has_children</w:t>
       </w:r>
       <w:r>
-        <w:t xml:space="preserve">  %}</w:t>
+        <w:t xml:space="preserve"> </w:t>
+      </w:r>
+      <w:r>
+        <w:t>and not users[0].country_of_birth == 'United States'</w:t>
+      </w:r>
+      <w:r>
+        <w:t xml:space="preserve"> %}</w:t>
       </w:r>
     </w:p>
     <w:tbl>
@@ -11521,6 +11489,7 @@
               <w:rPr>
                 <w:bCs/>
               </w:rPr>
+              <w:lastRenderedPageBreak/>
               <w:t>{%p endif %}</w:t>
             </w:r>
           </w:p>
@@ -11609,12 +11578,8 @@
       <w:pPr>
         <w:pStyle w:val="NoSpacing"/>
       </w:pPr>
-    </w:p>
-    <w:p>
-      <w:pPr>
-        <w:pStyle w:val="NoSpacing"/>
-      </w:pPr>
-      <w:r>
+      <w:r>
+        <w:lastRenderedPageBreak/>
         <w:t>{%p endif %}</w:t>
       </w:r>
     </w:p>
@@ -13317,6 +13282,7 @@
               <w:ind w:left="90"/>
             </w:pPr>
             <w:r>
+              <w:lastRenderedPageBreak/>
               <w:t>{%p if users[i].nacara_lpr %}</w:t>
             </w:r>
           </w:p>
@@ -13539,11 +13505,7 @@
               <w:jc w:val="center"/>
             </w:pPr>
             <w:r>
-              <w:t>{{ output_checkbox(</w:t>
-            </w:r>
-            <w:r>
-              <w:lastRenderedPageBreak/>
-              <w:t>users[i].lpr_signpost) }} YES  {{ output_checkbox(not users[i].lpr_signpost) }} NO</w:t>
+              <w:t>{{ output_checkbox(users[i].lpr_signpost) }} YES  {{ output_checkbox(not users[i].lpr_signpost) }} NO</w:t>
             </w:r>
           </w:p>
         </w:tc>
@@ -13895,7 +13857,11 @@
               <w:t>d</w:t>
             </w:r>
             <w:r>
-              <w:t>_yes) }} YES  {{ output_checkbox(not users[i].lpr_7</w:t>
+              <w:t xml:space="preserve">_yes) }} YES  {{ output_checkbox(not </w:t>
+            </w:r>
+            <w:r>
+              <w:lastRenderedPageBreak/>
+              <w:t>users[i].lpr_7</w:t>
             </w:r>
             <w:r>
               <w:t>d</w:t>
@@ -14110,7 +14076,6 @@
               <w:rPr>
                 <w:bCs/>
               </w:rPr>
-              <w:lastRenderedPageBreak/>
               <w:t>Date: {{ users[i].hearing_date. format(“MM/dd/yyyy”) }}</w:t>
             </w:r>
           </w:p>
@@ -14594,7 +14559,11 @@
               <w:jc w:val="center"/>
             </w:pPr>
             <w:r>
-              <w:t>{{ output_checkbox(users[i].notice_to_appear) }} YES  {{ output_checkbox(not users[i].notice_to_appear) }} NO</w:t>
+              <w:t>{{ output_checkbox(</w:t>
+            </w:r>
+            <w:r>
+              <w:lastRenderedPageBreak/>
+              <w:t>users[i].notice_to_appear) }} YES  {{ output_checkbox(not users[i].notice_to_appear) }} NO</w:t>
             </w:r>
           </w:p>
         </w:tc>
@@ -15070,6 +15039,7 @@
               <w:spacing w:after="0" w:line="240" w:lineRule="auto"/>
             </w:pPr>
             <w:r>
+              <w:lastRenderedPageBreak/>
               <w:t>{%p endif %}</w:t>
             </w:r>
           </w:p>
@@ -15312,11 +15282,7 @@
               <w:jc w:val="center"/>
             </w:pPr>
             <w:r>
-              <w:t>{{ output_checkbox(</w:t>
-            </w:r>
-            <w:r>
-              <w:lastRenderedPageBreak/>
-              <w:t>users[i].asylum_application) }} YES  {{ output_checkbox(not users[i].asylum_application) }} NO</w:t>
+              <w:t>{{ output_checkbox(users[i].asylum_application) }} YES  {{ output_checkbox(not users[i].asylum_application) }} NO</w:t>
             </w:r>
           </w:p>
         </w:tc>
@@ -15852,11 +15818,7 @@
               <w:jc w:val="center"/>
             </w:pPr>
             <w:r>
-              <w:t xml:space="preserve">{{ output_checkbox(users[i].general_fear_flee) }} YES  {{ output_checkbox(not </w:t>
-            </w:r>
-            <w:r>
-              <w:lastRenderedPageBreak/>
-              <w:t>users[i].general_fear_flee) }} NO</w:t>
+              <w:t>{{ output_checkbox(users[i].general_fear_flee) }} YES  {{ output_checkbox(not users[i].general_fear_flee) }} NO</w:t>
             </w:r>
           </w:p>
         </w:tc>
@@ -16591,11 +16553,7 @@
               <w:jc w:val="center"/>
             </w:pPr>
             <w:r>
-              <w:t xml:space="preserve">{{ output_checkbox(users[i].state_fear_non_government) }} YES  {{ </w:t>
-            </w:r>
-            <w:r>
-              <w:lastRenderedPageBreak/>
-              <w:t>output_checkbox(not users[i].state_fear_non_government) }} NO</w:t>
+              <w:t>{{ output_checkbox(users[i].state_fear_non_government) }} YES  {{ output_checkbox(not users[i].state_fear_non_government) }} NO</w:t>
             </w:r>
           </w:p>
         </w:tc>
@@ -16942,7 +16900,11 @@
               <w:jc w:val="center"/>
             </w:pPr>
             <w:r>
-              <w:t>{{ output_checkbox(users[i].internal_relocation_attempt) }} YES  {{ output_checkbox(not users[i].internal_relocation_attempt) }} NO</w:t>
+              <w:t>{{ output_checkbox(users[i].internal_relocation_attempt) }} YES  {{ output_checkbox(not users[i].internal_r</w:t>
+            </w:r>
+            <w:r>
+              <w:lastRenderedPageBreak/>
+              <w:t>elocation_attempt) }} NO</w:t>
             </w:r>
           </w:p>
         </w:tc>
@@ -17675,7 +17637,11 @@
               <w:jc w:val="center"/>
             </w:pPr>
             <w:r>
-              <w:t>{{ output_checkbox(users[i].future_persecution_others_yes) }} YES  {{ output_checkbox(not users[i].future_persecution_others_yes) }} NO</w:t>
+              <w:t>{{ output_checkbox(users[i].future_persecution_others_yes) }} YES  {{ output_checkbox(not users[i].future_pe</w:t>
+            </w:r>
+            <w:r>
+              <w:lastRenderedPageBreak/>
+              <w:t>rsecution_others_yes) }} NO</w:t>
             </w:r>
           </w:p>
         </w:tc>
@@ -17968,11 +17934,7 @@
               <w:spacing w:after="0" w:line="240" w:lineRule="auto"/>
             </w:pPr>
             <w:r>
-              <w:t>{{ output_checkbox(users[i].finishing_hurt_yes) }} YES  {{ output_checkbox(</w:t>
-            </w:r>
-            <w:r>
-              <w:lastRenderedPageBreak/>
-              <w:t>not users[i].finishing_hurt_yes) }} NO</w:t>
+              <w:t>{{ output_checkbox(users[i].finishing_hurt_yes) }} YES  {{ output_checkbox(not users[i].finishing_hurt_yes) }} NO</w:t>
             </w:r>
           </w:p>
         </w:tc>
@@ -18267,6 +18229,7 @@
               <w:spacing w:line="240" w:lineRule="auto"/>
             </w:pPr>
             <w:r>
+              <w:lastRenderedPageBreak/>
               <w:t xml:space="preserve">{{ users[i].finishing_long_stay_details }} </w:t>
             </w:r>
           </w:p>
@@ -18288,7 +18251,12 @@
               <w:spacing w:after="0" w:line="240" w:lineRule="auto"/>
             </w:pPr>
             <w:r>
-              <w:t>{{ output_checkbox(users[i].finishing_long_stay_yes) }} YES  {{ output_checkbox(not users[i].finishing_long_stay_yes) }} NO</w:t>
+              <w:lastRenderedPageBreak/>
+              <w:t>{{ output_checkbox(users[i].finishing_l</w:t>
+            </w:r>
+            <w:r>
+              <w:lastRenderedPageBreak/>
+              <w:t>ong_stay_yes) }} YES  {{ output_checkbox(not users[i].finishing_long_stay_yes) }} NO</w:t>
             </w:r>
           </w:p>
         </w:tc>
@@ -19531,15 +19499,7 @@
           <w:sz w:val="24"/>
           <w:szCs w:val="24"/>
         </w:rPr>
-        <w:t xml:space="preserve">SCREENER </w:t>
-      </w:r>
-      <w:r>
-        <w:rPr>
-          <w:b/>
-          <w:sz w:val="24"/>
-          <w:szCs w:val="24"/>
-        </w:rPr>
-        <w:t>EVALUATION</w:t>
+        <w:t>SCREENER EVALUATION</w:t>
       </w:r>
     </w:p>
     <w:p>
@@ -20245,6 +20205,7 @@
           <w:sz w:val="24"/>
           <w:szCs w:val="24"/>
         </w:rPr>
+        <w:lastRenderedPageBreak/>
         <w:t>☐</w:t>
       </w:r>
       <w:r>
@@ -20359,7 +20320,6 @@
               <w:rPr>
                 <w:noProof/>
               </w:rPr>
-              <w:lastRenderedPageBreak/>
               <w:drawing>
                 <wp:anchor distT="0" distB="0" distL="114300" distR="114300" simplePos="0" relativeHeight="251661312" behindDoc="0" locked="0" layoutInCell="1" hidden="0" allowOverlap="1" wp14:anchorId="3223A2E4" wp14:editId="1C2CCCB0">
                   <wp:simplePos x="0" y="0"/>
@@ -20479,16 +20439,7 @@
           <w:szCs w:val="44"/>
           <w:u w:val="single"/>
         </w:rPr>
-        <w:t xml:space="preserve">Legal Screening Summary for </w:t>
-      </w:r>
-      <w:r>
-        <w:rPr>
-          <w:b/>
-          <w:sz w:val="44"/>
-          <w:szCs w:val="44"/>
-          <w:u w:val="single"/>
-        </w:rPr>
-        <w:t>Applicant</w:t>
+        <w:t>Legal Screening Summary for Applicant</w:t>
       </w:r>
     </w:p>
     <w:p>
@@ -23559,7 +23510,6 @@
   <w:style w:type="character" w:default="1" w:styleId="DefaultParagraphFont">
     <w:name w:val="Default Paragraph Font"/>
     <w:uiPriority w:val="1"/>
-    <w:semiHidden/>
     <w:unhideWhenUsed/>
   </w:style>
   <w:style w:type="table" w:default="1" w:styleId="TableNormal">
@@ -24468,28 +24418,28 @@
 </file>
 
 <file path=customXml/item1.xml><?xml version="1.0" encoding="utf-8"?>
+<b:Sources xmlns:b="http://schemas.openxmlformats.org/officeDocument/2006/bibliography" xmlns="http://schemas.openxmlformats.org/officeDocument/2006/bibliography" SelectedStyle="\APASixthEditionOfficeOnline.xsl" StyleName="APA" Version="6"/>
+</file>
+
+<file path=customXml/item2.xml><?xml version="1.0" encoding="utf-8"?>
 <go:gDocsCustomXmlDataStorage xmlns:go="http://customooxmlschemas.google.com/" xmlns:r="http://schemas.openxmlformats.org/officeDocument/2006/relationships" uri="GoogleDocsCustomDataVersion2">
   <go:docsCustomData xmlns:go="http://customooxmlschemas.google.com/" roundtripDataSignature="AMtx7mgk80P8nN6TRawfk8U3hMHWQd0qkA==">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</go:docsCustomData>
 </go:gDocsCustomXmlDataStorage>
 </file>
 
-<file path=customXml/item2.xml><?xml version="1.0" encoding="utf-8"?>
-<b:Sources xmlns:b="http://schemas.openxmlformats.org/officeDocument/2006/bibliography" xmlns="http://schemas.openxmlformats.org/officeDocument/2006/bibliography" SelectedStyle="\APASixthEditionOfficeOnline.xsl" StyleName="APA" Version="6"/>
+<file path=customXml/itemProps1.xml><?xml version="1.0" encoding="utf-8"?>
+<ds:datastoreItem xmlns:ds="http://schemas.openxmlformats.org/officeDocument/2006/customXml" ds:itemID="{EC937E19-1730-49E0-BFF8-42A6EDD857C1}">
+  <ds:schemaRefs>
+    <ds:schemaRef ds:uri="http://schemas.openxmlformats.org/officeDocument/2006/bibliography"/>
+  </ds:schemaRefs>
+</ds:datastoreItem>
 </file>
 
-<file path=customXml/itemProps1.xml><?xml version="1.0" encoding="utf-8"?>
+<file path=customXml/itemProps2.xml><?xml version="1.0" encoding="utf-8"?>
 <ds:datastoreItem xmlns:ds="http://schemas.openxmlformats.org/officeDocument/2006/customXml" ds:itemID="{11111111-1234-1234-1234-123412341234}">
   <ds:schemaRefs>
     <ds:schemaRef ds:uri="http://customooxmlschemas.google.com/"/>
     <ds:schemaRef ds:uri="http://schemas.openxmlformats.org/officeDocument/2006/relationships"/>
   </ds:schemaRefs>
 </ds:datastoreItem>
-</file>
-
-<file path=customXml/itemProps2.xml><?xml version="1.0" encoding="utf-8"?>
-<ds:datastoreItem xmlns:ds="http://schemas.openxmlformats.org/officeDocument/2006/customXml" ds:itemID="{EC937E19-1730-49E0-BFF8-42A6EDD857C1}">
-  <ds:schemaRefs>
-    <ds:schemaRef ds:uri="http://schemas.openxmlformats.org/officeDocument/2006/bibliography"/>
-  </ds:schemaRefs>
-</ds:datastoreItem>
 </file>
</xml_diff>

<commit_message>
Additional fix to the DOCX formatting issue.
</commit_message>
<xml_diff>
--- a/docassemble/USCISApplications/data/templates/Comp_legal_screener.docx
+++ b/docassemble/USCISApplications/data/templates/Comp_legal_screener.docx
@@ -10465,44 +10465,49 @@
       <w:pPr>
         <w:pStyle w:val="NoSpacing"/>
       </w:pPr>
+    </w:p>
+    <w:p>
+      <w:pPr>
+        <w:pStyle w:val="NoSpacing"/>
+      </w:pPr>
+      <w:r>
+        <w:t xml:space="preserve">{%p </w:t>
+      </w:r>
+      <w:r>
+        <w:t xml:space="preserve">if </w:t>
+      </w:r>
+      <w:r>
+        <w:t>users[</w:t>
+      </w:r>
+      <w:r>
+        <w:t>i</w:t>
+      </w:r>
+      <w:r>
+        <w:t>].age_in_years() &lt; 21 and not users[</w:t>
+      </w:r>
+      <w:r>
+        <w:t>i</w:t>
+      </w:r>
+      <w:r>
+        <w:t>].married and not users[</w:t>
+      </w:r>
+      <w:r>
+        <w:t>i</w:t>
+      </w:r>
+      <w:r>
+        <w:t>].has_children</w:t>
+      </w:r>
+      <w:r>
+        <w:t xml:space="preserve"> </w:t>
+      </w:r>
+      <w:r>
+        <w:t>and not users[0].country_of_birth == 'United States'</w:t>
+      </w:r>
+      <w:r>
+        <w:t xml:space="preserve"> %}</w:t>
+      </w:r>
       <w:r>
         <w:br/>
-      </w:r>
-      <w:r>
-        <w:t xml:space="preserve">{%p </w:t>
-      </w:r>
-      <w:r>
-        <w:t xml:space="preserve">if </w:t>
-      </w:r>
-      <w:r>
-        <w:t>users[</w:t>
-      </w:r>
-      <w:r>
-        <w:t>i</w:t>
-      </w:r>
-      <w:r>
-        <w:t>].age_in_years() &lt; 21 and not users[</w:t>
-      </w:r>
-      <w:r>
-        <w:t>i</w:t>
-      </w:r>
-      <w:r>
-        <w:t>].married and not users[</w:t>
-      </w:r>
-      <w:r>
-        <w:t>i</w:t>
-      </w:r>
-      <w:r>
-        <w:t>].has_children</w:t>
-      </w:r>
-      <w:r>
-        <w:t xml:space="preserve"> </w:t>
-      </w:r>
-      <w:r>
-        <w:t>and not users[0].country_of_birth == 'United States'</w:t>
-      </w:r>
-      <w:r>
-        <w:t xml:space="preserve"> %}</w:t>
       </w:r>
     </w:p>
     <w:tbl>
@@ -11462,6 +11467,7 @@
               <w:rPr>
                 <w:bCs/>
               </w:rPr>
+              <w:lastRenderedPageBreak/>
               <w:t xml:space="preserve">a. {{ </w:t>
             </w:r>
             <w:r>
@@ -11489,7 +11495,6 @@
               <w:rPr>
                 <w:bCs/>
               </w:rPr>
-              <w:lastRenderedPageBreak/>
               <w:t>{%p endif %}</w:t>
             </w:r>
           </w:p>
@@ -13282,7 +13287,6 @@
               <w:ind w:left="90"/>
             </w:pPr>
             <w:r>
-              <w:lastRenderedPageBreak/>
               <w:t>{%p if users[i].nacara_lpr %}</w:t>
             </w:r>
           </w:p>
@@ -23510,6 +23514,7 @@
   <w:style w:type="character" w:default="1" w:styleId="DefaultParagraphFont">
     <w:name w:val="Default Paragraph Font"/>
     <w:uiPriority w:val="1"/>
+    <w:semiHidden/>
     <w:unhideWhenUsed/>
   </w:style>
   <w:style w:type="table" w:default="1" w:styleId="TableNormal">
@@ -24418,28 +24423,28 @@
 </file>
 
 <file path=customXml/item1.xml><?xml version="1.0" encoding="utf-8"?>
-<b:Sources xmlns:b="http://schemas.openxmlformats.org/officeDocument/2006/bibliography" xmlns="http://schemas.openxmlformats.org/officeDocument/2006/bibliography" SelectedStyle="\APASixthEditionOfficeOnline.xsl" StyleName="APA" Version="6"/>
-</file>
-
-<file path=customXml/item2.xml><?xml version="1.0" encoding="utf-8"?>
 <go:gDocsCustomXmlDataStorage xmlns:go="http://customooxmlschemas.google.com/" xmlns:r="http://schemas.openxmlformats.org/officeDocument/2006/relationships" uri="GoogleDocsCustomDataVersion2">
   <go:docsCustomData xmlns:go="http://customooxmlschemas.google.com/" roundtripDataSignature="AMtx7mgk80P8nN6TRawfk8U3hMHWQd0qkA==">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</go:docsCustomData>
 </go:gDocsCustomXmlDataStorage>
 </file>
 
-<file path=customXml/itemProps1.xml><?xml version="1.0" encoding="utf-8"?>
-<ds:datastoreItem xmlns:ds="http://schemas.openxmlformats.org/officeDocument/2006/customXml" ds:itemID="{EC937E19-1730-49E0-BFF8-42A6EDD857C1}">
-  <ds:schemaRefs>
-    <ds:schemaRef ds:uri="http://schemas.openxmlformats.org/officeDocument/2006/bibliography"/>
-  </ds:schemaRefs>
-</ds:datastoreItem>
+<file path=customXml/item2.xml><?xml version="1.0" encoding="utf-8"?>
+<b:Sources xmlns:b="http://schemas.openxmlformats.org/officeDocument/2006/bibliography" xmlns="http://schemas.openxmlformats.org/officeDocument/2006/bibliography" SelectedStyle="\APASixthEditionOfficeOnline.xsl" StyleName="APA" Version="6"/>
 </file>
 
-<file path=customXml/itemProps2.xml><?xml version="1.0" encoding="utf-8"?>
+<file path=customXml/itemProps1.xml><?xml version="1.0" encoding="utf-8"?>
 <ds:datastoreItem xmlns:ds="http://schemas.openxmlformats.org/officeDocument/2006/customXml" ds:itemID="{11111111-1234-1234-1234-123412341234}">
   <ds:schemaRefs>
     <ds:schemaRef ds:uri="http://customooxmlschemas.google.com/"/>
     <ds:schemaRef ds:uri="http://schemas.openxmlformats.org/officeDocument/2006/relationships"/>
   </ds:schemaRefs>
 </ds:datastoreItem>
+</file>
+
+<file path=customXml/itemProps2.xml><?xml version="1.0" encoding="utf-8"?>
+<ds:datastoreItem xmlns:ds="http://schemas.openxmlformats.org/officeDocument/2006/customXml" ds:itemID="{EC937E19-1730-49E0-BFF8-42A6EDD857C1}">
+  <ds:schemaRefs>
+    <ds:schemaRef ds:uri="http://schemas.openxmlformats.org/officeDocument/2006/bibliography"/>
+  </ds:schemaRefs>
+</ds:datastoreItem>
 </file>
</xml_diff>